<commit_message>
Retiro del paquete los documentos de trabajo interno y corrijo los entregables tras la revision
</commit_message>
<xml_diff>
--- a/docs/analisis/INVENTRA_Historias_Usuario_Backlog.docx
+++ b/docs/analisis/INVENTRA_Historias_Usuario_Backlog.docx
@@ -4,122 +4,114 @@
   <w:body>
     <w:p>
       <w:pPr>
-        <w:spacing w:before="1900" w:after="0" w:line="264"/>
+        <w:spacing w:before="1900" w:line="264" w:lineRule="auto"/>
         <w:jc w:val="center"/>
       </w:pPr>
       <w:r>
         <w:rPr>
-          <w:rFonts w:ascii="Arial" w:hAnsi="Arial" w:cs="Arial" w:eastAsia="Arial"/>
           <w:b/>
           <w:bCs/>
           <w:color w:val="1F3864"/>
           <w:sz w:val="52"/>
           <w:szCs w:val="52"/>
         </w:rPr>
-        <w:t xml:space="preserve">PRODUCT BACKLOG E HISTORIAS DE USUARIO (SCRUM)</w:t>
+        <w:t>PRODUCT BACKLOG E HISTORIAS DE USUARIO (SCRUM)</w:t>
       </w:r>
     </w:p>
     <w:p>
       <w:pPr>
-        <w:spacing w:before="150" w:after="0" w:line="264"/>
+        <w:spacing w:before="150" w:line="264" w:lineRule="auto"/>
         <w:jc w:val="center"/>
       </w:pPr>
       <w:r>
         <w:rPr>
-          <w:rFonts w:ascii="Arial" w:hAnsi="Arial" w:cs="Arial" w:eastAsia="Arial"/>
           <w:color w:val="2E5496"/>
           <w:sz w:val="26"/>
           <w:szCs w:val="26"/>
         </w:rPr>
-        <w:t xml:space="preserve">Proyecto INVENTRA — Aplicación web de inventario y ventas para licoreras</w:t>
+        <w:t>Proyecto INVENTRA — Aplicación web de inventario y ventas para licoreras</w:t>
       </w:r>
     </w:p>
     <w:p>
       <w:pPr>
-        <w:spacing w:before="2600" w:after="0" w:line="264"/>
+        <w:spacing w:before="2600" w:line="264" w:lineRule="auto"/>
         <w:jc w:val="center"/>
       </w:pPr>
       <w:r>
         <w:rPr>
-          <w:rFonts w:ascii="Arial" w:hAnsi="Arial" w:cs="Arial" w:eastAsia="Arial"/>
           <w:b/>
           <w:bCs/>
           <w:sz w:val="28"/>
           <w:szCs w:val="28"/>
         </w:rPr>
-        <w:t xml:space="preserve">CRISTIAN DARÍO MACÍAS ESPITIA</w:t>
+        <w:t>CRISTIAN DARÍO MACÍAS ESPITIA</w:t>
       </w:r>
     </w:p>
     <w:p>
       <w:pPr>
-        <w:spacing w:before="2700" w:after="0" w:line="264"/>
+        <w:spacing w:before="2700" w:line="264" w:lineRule="auto"/>
         <w:jc w:val="center"/>
       </w:pPr>
       <w:r>
         <w:rPr>
-          <w:rFonts w:ascii="Arial" w:hAnsi="Arial" w:cs="Arial" w:eastAsia="Arial"/>
           <w:b/>
           <w:bCs/>
           <w:sz w:val="26"/>
           <w:szCs w:val="26"/>
         </w:rPr>
-        <w:t xml:space="preserve">SERVICIO NACIONAL DE APRENDIZAJE (SENA)</w:t>
+        <w:t>SERVICIO NACIONAL DE APRENDIZAJE (SENA)</w:t>
       </w:r>
     </w:p>
     <w:p>
       <w:pPr>
-        <w:spacing w:before="70" w:after="0" w:line="264"/>
+        <w:spacing w:before="70" w:line="264" w:lineRule="auto"/>
         <w:jc w:val="center"/>
       </w:pPr>
       <w:r>
         <w:rPr>
-          <w:rFonts w:ascii="Arial" w:hAnsi="Arial" w:cs="Arial" w:eastAsia="Arial"/>
           <w:sz w:val="26"/>
           <w:szCs w:val="26"/>
         </w:rPr>
-        <w:t xml:space="preserve">CENTRO DE FORMACIÓN EN DISEÑO, CONFECCIÓN Y MODA</w:t>
+        <w:t>CENTRO DE FORMACIÓN EN DISEÑO, CONFECCIÓN Y MODA</w:t>
       </w:r>
     </w:p>
     <w:p>
       <w:pPr>
-        <w:spacing w:before="70" w:after="0" w:line="264"/>
+        <w:spacing w:before="70" w:line="264" w:lineRule="auto"/>
         <w:jc w:val="center"/>
       </w:pPr>
       <w:r>
         <w:rPr>
-          <w:rFonts w:ascii="Arial" w:hAnsi="Arial" w:cs="Arial" w:eastAsia="Arial"/>
           <w:sz w:val="26"/>
           <w:szCs w:val="26"/>
         </w:rPr>
-        <w:t xml:space="preserve">ANÁLISIS Y DESARROLLO DE SOFTWARE</w:t>
+        <w:t>ANÁLISIS Y DESARROLLO DE SOFTWARE</w:t>
       </w:r>
     </w:p>
     <w:p>
       <w:pPr>
-        <w:spacing w:before="70" w:after="0" w:line="264"/>
+        <w:spacing w:before="70" w:line="264" w:lineRule="auto"/>
         <w:jc w:val="center"/>
       </w:pPr>
       <w:r>
         <w:rPr>
-          <w:rFonts w:ascii="Arial" w:hAnsi="Arial" w:cs="Arial" w:eastAsia="Arial"/>
           <w:sz w:val="26"/>
           <w:szCs w:val="26"/>
         </w:rPr>
-        <w:t xml:space="preserve">MEDELLÍN</w:t>
+        <w:t>MEDELLÍN</w:t>
       </w:r>
     </w:p>
     <w:p>
       <w:pPr>
-        <w:spacing w:before="70" w:after="0" w:line="264"/>
+        <w:spacing w:before="70" w:line="264" w:lineRule="auto"/>
         <w:jc w:val="center"/>
       </w:pPr>
       <w:r>
         <w:rPr>
-          <w:rFonts w:ascii="Arial" w:hAnsi="Arial" w:cs="Arial" w:eastAsia="Arial"/>
           <w:sz w:val="26"/>
           <w:szCs w:val="26"/>
         </w:rPr>
-        <w:t xml:space="preserve">2026</w:t>
+        <w:t>2026</w:t>
       </w:r>
     </w:p>
     <w:p>
@@ -140,6 +132,7 @@
           <w:sz w:val="32"/>
           <w:szCs w:val="32"/>
         </w:rPr>
+        <w:lastRenderedPageBreak/>
         <w:t>HISTORIAS DE USUARIO Y PRODUCT BACKLOG</w:t>
       </w:r>
     </w:p>
@@ -207,15 +200,7 @@
         <w:jc w:val="both"/>
       </w:pPr>
       <w:r>
-        <w:t xml:space="preserve">Este documento contiene el </w:t>
-      </w:r>
-      <w:proofErr w:type="spellStart"/>
-      <w:r>
-        <w:t>Product</w:t>
-      </w:r>
-      <w:proofErr w:type="spellEnd"/>
-      <w:r>
-        <w:t xml:space="preserve"> Backlog del proyecto INVENTRA: la lista priorizada y estimada de historias de usuario que describen, en lenguaje del usuario, lo que el sistema debe hacer. Las historias se derivan de los 48 requisitos funcionales de la Especificación de Requisitos de Software (ERS IEEE 830) y se gestionan bajo el marco ágil Scrum.</w:t>
+        <w:t>Este documento contiene el Product Backlog del proyecto INVENTRA: la lista priorizada y estimada de historias de usuario que describen, en lenguaje del usuario, lo que el sistema debe hacer. Las historias se derivan de los 48 requisitos funcionales de la Especificación de Requisitos de Software (ERS IEEE 830) y se gestionan bajo el marco ágil Scrum.</w:t>
       </w:r>
     </w:p>
     <w:p>
@@ -231,15 +216,7 @@
         <w:t xml:space="preserve">Gestión en Trello. </w:t>
       </w:r>
       <w:r>
-        <w:t xml:space="preserve">El backlog y los </w:t>
-      </w:r>
-      <w:proofErr w:type="spellStart"/>
-      <w:r>
-        <w:t>sprints</w:t>
-      </w:r>
-      <w:proofErr w:type="spellEnd"/>
-      <w:r>
-        <w:t xml:space="preserve"> se administran en un tablero de Trello, cuyo enlace y acceso se comparten con el área técnica. Cada historia es una </w:t>
+        <w:t xml:space="preserve">El backlog y los sprints se administran en un tablero de Trello, cuyo enlace y acceso se comparten con el área técnica. Cada historia es una </w:t>
       </w:r>
       <w:r>
         <w:t xml:space="preserve">tarea dentro de una </w:t>
@@ -267,15 +244,7 @@
         <w:t xml:space="preserve">Estructura del tablero (dos fases). </w:t>
       </w:r>
       <w:r>
-        <w:t xml:space="preserve">El tablero refleja todo el proceso, no solo la programación. Las PRIMERAS tarjetas son los entregables de análisis y diseño (mapa de empatía, Lean </w:t>
-      </w:r>
-      <w:proofErr w:type="spellStart"/>
-      <w:r>
-        <w:t>Canvas</w:t>
-      </w:r>
-      <w:proofErr w:type="spellEnd"/>
-      <w:r>
-        <w:t>, historias de usuario, prototipo, UML, documento de diseño, Brand Book y propuesta técnica): son las tareas que habilitan el paso al código. Después viene la construcción, organizada POR MÓDULO.</w:t>
+        <w:t>El tablero refleja todo el proceso, no solo la programación. Las PRIMERAS tarjetas son los entregables de análisis y diseño (mapa de empatía, Lean Canvas, historias de usuario, prototipo, UML, documento de diseño, Brand Book y propuesta técnica): son las tareas que habilitan el paso al código. Después viene la construcción, organizada POR MÓDULO.</w:t>
       </w:r>
     </w:p>
     <w:p>
@@ -304,21 +273,12 @@
         <w:spacing w:after="50" w:line="258" w:lineRule="auto"/>
         <w:jc w:val="both"/>
       </w:pPr>
-      <w:proofErr w:type="spellStart"/>
       <w:r>
         <w:rPr>
           <w:b/>
           <w:bCs/>
         </w:rPr>
-        <w:t>Product</w:t>
-      </w:r>
-      <w:proofErr w:type="spellEnd"/>
-      <w:r>
-        <w:rPr>
-          <w:b/>
-          <w:bCs/>
-        </w:rPr>
-        <w:t xml:space="preserve"> Owner: </w:t>
+        <w:t xml:space="preserve">Product Owner: </w:t>
       </w:r>
       <w:r>
         <w:t>define y prioriza el backlog (rol asumido por el aprendiz, con la validación del instructor).</w:t>
@@ -339,23 +299,7 @@
           <w:b/>
           <w:bCs/>
         </w:rPr>
-        <w:t xml:space="preserve">Scrum </w:t>
-      </w:r>
-      <w:proofErr w:type="gramStart"/>
-      <w:r>
-        <w:rPr>
-          <w:b/>
-          <w:bCs/>
-        </w:rPr>
-        <w:t>Master</w:t>
-      </w:r>
-      <w:proofErr w:type="gramEnd"/>
-      <w:r>
-        <w:rPr>
-          <w:b/>
-          <w:bCs/>
-        </w:rPr>
-        <w:t xml:space="preserve">: </w:t>
+        <w:t xml:space="preserve">Scrum Master: </w:t>
       </w:r>
       <w:r>
         <w:t>facilita el proceso y remueve impedimentos (rol asumido por el aprendiz).</w:t>
@@ -513,12 +457,6 @@
         <w:gridCol w:w="6360"/>
       </w:tblGrid>
       <w:tr>
-        <w:tblPrEx>
-          <w:tblCellMar>
-            <w:top w:w="0" w:type="dxa"/>
-            <w:bottom w:w="0" w:type="dxa"/>
-          </w:tblCellMar>
-        </w:tblPrEx>
         <w:trPr>
           <w:tblHeader/>
         </w:trPr>
@@ -578,12 +516,6 @@
         </w:tc>
       </w:tr>
       <w:tr>
-        <w:tblPrEx>
-          <w:tblCellMar>
-            <w:top w:w="0" w:type="dxa"/>
-            <w:bottom w:w="0" w:type="dxa"/>
-          </w:tblCellMar>
-        </w:tblPrEx>
         <w:tc>
           <w:tcPr>
             <w:tcW w:w="3000" w:type="dxa"/>
@@ -634,12 +566,6 @@
         </w:tc>
       </w:tr>
       <w:tr>
-        <w:tblPrEx>
-          <w:tblCellMar>
-            <w:top w:w="0" w:type="dxa"/>
-            <w:bottom w:w="0" w:type="dxa"/>
-          </w:tblCellMar>
-        </w:tblPrEx>
         <w:tc>
           <w:tcPr>
             <w:tcW w:w="3000" w:type="dxa"/>
@@ -690,12 +616,6 @@
         </w:tc>
       </w:tr>
       <w:tr>
-        <w:tblPrEx>
-          <w:tblCellMar>
-            <w:top w:w="0" w:type="dxa"/>
-            <w:bottom w:w="0" w:type="dxa"/>
-          </w:tblCellMar>
-        </w:tblPrEx>
         <w:tc>
           <w:tcPr>
             <w:tcW w:w="3000" w:type="dxa"/>
@@ -740,23 +660,7 @@
                 <w:sz w:val="18"/>
                 <w:szCs w:val="18"/>
               </w:rPr>
-              <w:t>Administra la plataforma: licoreras (</w:t>
-            </w:r>
-            <w:proofErr w:type="spellStart"/>
-            <w:r>
-              <w:rPr>
-                <w:sz w:val="18"/>
-                <w:szCs w:val="18"/>
-              </w:rPr>
-              <w:t>tenants</w:t>
-            </w:r>
-            <w:proofErr w:type="spellEnd"/>
-            <w:r>
-              <w:rPr>
-                <w:sz w:val="18"/>
-                <w:szCs w:val="18"/>
-              </w:rPr>
-              <w:t>), planes y estado de las suscripciones.</w:t>
+              <w:t>Administra la plataforma: licoreras (tenants), planes y estado de las suscripciones.</w:t>
             </w:r>
           </w:p>
         </w:tc>
@@ -777,29 +681,7 @@
           <w:szCs w:val="28"/>
         </w:rPr>
         <w:lastRenderedPageBreak/>
-        <w:t xml:space="preserve">3. </w:t>
-      </w:r>
-      <w:proofErr w:type="spellStart"/>
-      <w:r>
-        <w:rPr>
-          <w:b/>
-          <w:bCs/>
-          <w:color w:val="1F3864"/>
-          <w:sz w:val="28"/>
-          <w:szCs w:val="28"/>
-        </w:rPr>
-        <w:t>Product</w:t>
-      </w:r>
-      <w:proofErr w:type="spellEnd"/>
-      <w:r>
-        <w:rPr>
-          <w:b/>
-          <w:bCs/>
-          <w:color w:val="1F3864"/>
-          <w:sz w:val="28"/>
-          <w:szCs w:val="28"/>
-        </w:rPr>
-        <w:t xml:space="preserve"> Backlog</w:t>
+        <w:t>3. Product Backlog</w:t>
       </w:r>
     </w:p>
     <w:p>
@@ -837,12 +719,6 @@
         <w:gridCol w:w="560"/>
       </w:tblGrid>
       <w:tr>
-        <w:tblPrEx>
-          <w:tblCellMar>
-            <w:top w:w="0" w:type="dxa"/>
-            <w:bottom w:w="0" w:type="dxa"/>
-          </w:tblCellMar>
-        </w:tblPrEx>
         <w:trPr>
           <w:tblHeader/>
         </w:trPr>
@@ -969,7 +845,6 @@
             <w:pPr>
               <w:spacing w:line="230" w:lineRule="auto"/>
             </w:pPr>
-            <w:proofErr w:type="spellStart"/>
             <w:r>
               <w:rPr>
                 <w:b/>
@@ -980,17 +855,10 @@
               </w:rPr>
               <w:t>Pts</w:t>
             </w:r>
-            <w:proofErr w:type="spellEnd"/>
           </w:p>
         </w:tc>
       </w:tr>
       <w:tr>
-        <w:tblPrEx>
-          <w:tblCellMar>
-            <w:top w:w="0" w:type="dxa"/>
-            <w:bottom w:w="0" w:type="dxa"/>
-          </w:tblCellMar>
-        </w:tblPrEx>
         <w:tc>
           <w:tcPr>
             <w:tcW w:w="760" w:type="dxa"/>
@@ -1117,12 +985,6 @@
         </w:tc>
       </w:tr>
       <w:tr>
-        <w:tblPrEx>
-          <w:tblCellMar>
-            <w:top w:w="0" w:type="dxa"/>
-            <w:bottom w:w="0" w:type="dxa"/>
-          </w:tblCellMar>
-        </w:tblPrEx>
         <w:tc>
           <w:tcPr>
             <w:tcW w:w="760" w:type="dxa"/>
@@ -1191,7 +1053,14 @@
                 <w:sz w:val="17"/>
                 <w:szCs w:val="17"/>
               </w:rPr>
-              <w:t>Como usuario, quiero iniciar sesión con mi correo y contraseña, para acceder de forma segura.</w:t>
+              <w:t>Como usuario, quiero iniciar sesión con mi correo y contraseña, para acceder de forma segura</w:t>
+            </w:r>
+            <w:r>
+              <w:rPr>
+                <w:sz w:val="17"/>
+                <w:szCs w:val="17"/>
+              </w:rPr>
+              <w:t>.</w:t>
             </w:r>
           </w:p>
         </w:tc>
@@ -1249,12 +1118,6 @@
         </w:tc>
       </w:tr>
       <w:tr>
-        <w:tblPrEx>
-          <w:tblCellMar>
-            <w:top w:w="0" w:type="dxa"/>
-            <w:bottom w:w="0" w:type="dxa"/>
-          </w:tblCellMar>
-        </w:tblPrEx>
         <w:tc>
           <w:tcPr>
             <w:tcW w:w="760" w:type="dxa"/>
@@ -1381,12 +1244,6 @@
         </w:tc>
       </w:tr>
       <w:tr>
-        <w:tblPrEx>
-          <w:tblCellMar>
-            <w:top w:w="0" w:type="dxa"/>
-            <w:bottom w:w="0" w:type="dxa"/>
-          </w:tblCellMar>
-        </w:tblPrEx>
         <w:tc>
           <w:tcPr>
             <w:tcW w:w="760" w:type="dxa"/>
@@ -1513,12 +1370,6 @@
         </w:tc>
       </w:tr>
       <w:tr>
-        <w:tblPrEx>
-          <w:tblCellMar>
-            <w:top w:w="0" w:type="dxa"/>
-            <w:bottom w:w="0" w:type="dxa"/>
-          </w:tblCellMar>
-        </w:tblPrEx>
         <w:tc>
           <w:tcPr>
             <w:tcW w:w="760" w:type="dxa"/>
@@ -1645,12 +1496,6 @@
         </w:tc>
       </w:tr>
       <w:tr>
-        <w:tblPrEx>
-          <w:tblCellMar>
-            <w:top w:w="0" w:type="dxa"/>
-            <w:bottom w:w="0" w:type="dxa"/>
-          </w:tblCellMar>
-        </w:tblPrEx>
         <w:tc>
           <w:tcPr>
             <w:tcW w:w="760" w:type="dxa"/>
@@ -1777,12 +1622,6 @@
         </w:tc>
       </w:tr>
       <w:tr>
-        <w:tblPrEx>
-          <w:tblCellMar>
-            <w:top w:w="0" w:type="dxa"/>
-            <w:bottom w:w="0" w:type="dxa"/>
-          </w:tblCellMar>
-        </w:tblPrEx>
         <w:tc>
           <w:tcPr>
             <w:tcW w:w="760" w:type="dxa"/>
@@ -1909,12 +1748,6 @@
         </w:tc>
       </w:tr>
       <w:tr>
-        <w:tblPrEx>
-          <w:tblCellMar>
-            <w:top w:w="0" w:type="dxa"/>
-            <w:bottom w:w="0" w:type="dxa"/>
-          </w:tblCellMar>
-        </w:tblPrEx>
         <w:tc>
           <w:tcPr>
             <w:tcW w:w="760" w:type="dxa"/>
@@ -2041,12 +1874,6 @@
         </w:tc>
       </w:tr>
       <w:tr>
-        <w:tblPrEx>
-          <w:tblCellMar>
-            <w:top w:w="0" w:type="dxa"/>
-            <w:bottom w:w="0" w:type="dxa"/>
-          </w:tblCellMar>
-        </w:tblPrEx>
         <w:tc>
           <w:tcPr>
             <w:tcW w:w="760" w:type="dxa"/>
@@ -2173,12 +2000,6 @@
         </w:tc>
       </w:tr>
       <w:tr>
-        <w:tblPrEx>
-          <w:tblCellMar>
-            <w:top w:w="0" w:type="dxa"/>
-            <w:bottom w:w="0" w:type="dxa"/>
-          </w:tblCellMar>
-        </w:tblPrEx>
         <w:tc>
           <w:tcPr>
             <w:tcW w:w="760" w:type="dxa"/>
@@ -2305,12 +2126,6 @@
         </w:tc>
       </w:tr>
       <w:tr>
-        <w:tblPrEx>
-          <w:tblCellMar>
-            <w:top w:w="0" w:type="dxa"/>
-            <w:bottom w:w="0" w:type="dxa"/>
-          </w:tblCellMar>
-        </w:tblPrEx>
         <w:tc>
           <w:tcPr>
             <w:tcW w:w="760" w:type="dxa"/>
@@ -2437,12 +2252,6 @@
         </w:tc>
       </w:tr>
       <w:tr>
-        <w:tblPrEx>
-          <w:tblCellMar>
-            <w:top w:w="0" w:type="dxa"/>
-            <w:bottom w:w="0" w:type="dxa"/>
-          </w:tblCellMar>
-        </w:tblPrEx>
         <w:tc>
           <w:tcPr>
             <w:tcW w:w="760" w:type="dxa"/>
@@ -2569,12 +2378,6 @@
         </w:tc>
       </w:tr>
       <w:tr>
-        <w:tblPrEx>
-          <w:tblCellMar>
-            <w:top w:w="0" w:type="dxa"/>
-            <w:bottom w:w="0" w:type="dxa"/>
-          </w:tblCellMar>
-        </w:tblPrEx>
         <w:tc>
           <w:tcPr>
             <w:tcW w:w="760" w:type="dxa"/>
@@ -2701,12 +2504,6 @@
         </w:tc>
       </w:tr>
       <w:tr>
-        <w:tblPrEx>
-          <w:tblCellMar>
-            <w:top w:w="0" w:type="dxa"/>
-            <w:bottom w:w="0" w:type="dxa"/>
-          </w:tblCellMar>
-        </w:tblPrEx>
         <w:tc>
           <w:tcPr>
             <w:tcW w:w="760" w:type="dxa"/>
@@ -2833,12 +2630,6 @@
         </w:tc>
       </w:tr>
       <w:tr>
-        <w:tblPrEx>
-          <w:tblCellMar>
-            <w:top w:w="0" w:type="dxa"/>
-            <w:bottom w:w="0" w:type="dxa"/>
-          </w:tblCellMar>
-        </w:tblPrEx>
         <w:tc>
           <w:tcPr>
             <w:tcW w:w="760" w:type="dxa"/>
@@ -2965,12 +2756,6 @@
         </w:tc>
       </w:tr>
       <w:tr>
-        <w:tblPrEx>
-          <w:tblCellMar>
-            <w:top w:w="0" w:type="dxa"/>
-            <w:bottom w:w="0" w:type="dxa"/>
-          </w:tblCellMar>
-        </w:tblPrEx>
         <w:tc>
           <w:tcPr>
             <w:tcW w:w="760" w:type="dxa"/>
@@ -3039,23 +2824,7 @@
                 <w:sz w:val="17"/>
                 <w:szCs w:val="17"/>
               </w:rPr>
-              <w:t xml:space="preserve">Como administrador, quiero consultar el </w:t>
-            </w:r>
-            <w:proofErr w:type="spellStart"/>
-            <w:r>
-              <w:rPr>
-                <w:sz w:val="17"/>
-                <w:szCs w:val="17"/>
-              </w:rPr>
-              <w:t>kardex</w:t>
-            </w:r>
-            <w:proofErr w:type="spellEnd"/>
-            <w:r>
-              <w:rPr>
-                <w:sz w:val="17"/>
-                <w:szCs w:val="17"/>
-              </w:rPr>
-              <w:t xml:space="preserve"> de un producto, para ver todos sus movimientos y saldos.</w:t>
+              <w:t>Como administrador, quiero consultar el kardex de un producto, para ver todos sus movimientos y saldos.</w:t>
             </w:r>
           </w:p>
         </w:tc>
@@ -3113,12 +2882,6 @@
         </w:tc>
       </w:tr>
       <w:tr>
-        <w:tblPrEx>
-          <w:tblCellMar>
-            <w:top w:w="0" w:type="dxa"/>
-            <w:bottom w:w="0" w:type="dxa"/>
-          </w:tblCellMar>
-        </w:tblPrEx>
         <w:tc>
           <w:tcPr>
             <w:tcW w:w="760" w:type="dxa"/>
@@ -3245,12 +3008,6 @@
         </w:tc>
       </w:tr>
       <w:tr>
-        <w:tblPrEx>
-          <w:tblCellMar>
-            <w:top w:w="0" w:type="dxa"/>
-            <w:bottom w:w="0" w:type="dxa"/>
-          </w:tblCellMar>
-        </w:tblPrEx>
         <w:tc>
           <w:tcPr>
             <w:tcW w:w="760" w:type="dxa"/>
@@ -3377,12 +3134,6 @@
         </w:tc>
       </w:tr>
       <w:tr>
-        <w:tblPrEx>
-          <w:tblCellMar>
-            <w:top w:w="0" w:type="dxa"/>
-            <w:bottom w:w="0" w:type="dxa"/>
-          </w:tblCellMar>
-        </w:tblPrEx>
         <w:tc>
           <w:tcPr>
             <w:tcW w:w="760" w:type="dxa"/>
@@ -3509,12 +3260,6 @@
         </w:tc>
       </w:tr>
       <w:tr>
-        <w:tblPrEx>
-          <w:tblCellMar>
-            <w:top w:w="0" w:type="dxa"/>
-            <w:bottom w:w="0" w:type="dxa"/>
-          </w:tblCellMar>
-        </w:tblPrEx>
         <w:tc>
           <w:tcPr>
             <w:tcW w:w="760" w:type="dxa"/>
@@ -3641,12 +3386,6 @@
         </w:tc>
       </w:tr>
       <w:tr>
-        <w:tblPrEx>
-          <w:tblCellMar>
-            <w:top w:w="0" w:type="dxa"/>
-            <w:bottom w:w="0" w:type="dxa"/>
-          </w:tblCellMar>
-        </w:tblPrEx>
         <w:tc>
           <w:tcPr>
             <w:tcW w:w="760" w:type="dxa"/>
@@ -3773,12 +3512,6 @@
         </w:tc>
       </w:tr>
       <w:tr>
-        <w:tblPrEx>
-          <w:tblCellMar>
-            <w:top w:w="0" w:type="dxa"/>
-            <w:bottom w:w="0" w:type="dxa"/>
-          </w:tblCellMar>
-        </w:tblPrEx>
         <w:tc>
           <w:tcPr>
             <w:tcW w:w="760" w:type="dxa"/>
@@ -3905,12 +3638,6 @@
         </w:tc>
       </w:tr>
       <w:tr>
-        <w:tblPrEx>
-          <w:tblCellMar>
-            <w:top w:w="0" w:type="dxa"/>
-            <w:bottom w:w="0" w:type="dxa"/>
-          </w:tblCellMar>
-        </w:tblPrEx>
         <w:tc>
           <w:tcPr>
             <w:tcW w:w="760" w:type="dxa"/>
@@ -4037,12 +3764,6 @@
         </w:tc>
       </w:tr>
       <w:tr>
-        <w:tblPrEx>
-          <w:tblCellMar>
-            <w:top w:w="0" w:type="dxa"/>
-            <w:bottom w:w="0" w:type="dxa"/>
-          </w:tblCellMar>
-        </w:tblPrEx>
         <w:tc>
           <w:tcPr>
             <w:tcW w:w="760" w:type="dxa"/>
@@ -4169,12 +3890,6 @@
         </w:tc>
       </w:tr>
       <w:tr>
-        <w:tblPrEx>
-          <w:tblCellMar>
-            <w:top w:w="0" w:type="dxa"/>
-            <w:bottom w:w="0" w:type="dxa"/>
-          </w:tblCellMar>
-        </w:tblPrEx>
         <w:tc>
           <w:tcPr>
             <w:tcW w:w="760" w:type="dxa"/>
@@ -4301,12 +4016,6 @@
         </w:tc>
       </w:tr>
       <w:tr>
-        <w:tblPrEx>
-          <w:tblCellMar>
-            <w:top w:w="0" w:type="dxa"/>
-            <w:bottom w:w="0" w:type="dxa"/>
-          </w:tblCellMar>
-        </w:tblPrEx>
         <w:tc>
           <w:tcPr>
             <w:tcW w:w="760" w:type="dxa"/>
@@ -4433,12 +4142,6 @@
         </w:tc>
       </w:tr>
       <w:tr>
-        <w:tblPrEx>
-          <w:tblCellMar>
-            <w:top w:w="0" w:type="dxa"/>
-            <w:bottom w:w="0" w:type="dxa"/>
-          </w:tblCellMar>
-        </w:tblPrEx>
         <w:tc>
           <w:tcPr>
             <w:tcW w:w="760" w:type="dxa"/>
@@ -4507,23 +4210,7 @@
                 <w:sz w:val="17"/>
                 <w:szCs w:val="17"/>
               </w:rPr>
-              <w:t xml:space="preserve">Como administrador (Pro), quiero asignar usuarios a sedes, para controlar dónde opera </w:t>
-            </w:r>
-            <w:proofErr w:type="gramStart"/>
-            <w:r>
-              <w:rPr>
-                <w:sz w:val="17"/>
-                <w:szCs w:val="17"/>
-              </w:rPr>
-              <w:t>cada quien</w:t>
-            </w:r>
-            <w:proofErr w:type="gramEnd"/>
-            <w:r>
-              <w:rPr>
-                <w:sz w:val="17"/>
-                <w:szCs w:val="17"/>
-              </w:rPr>
-              <w:t>.</w:t>
+              <w:t>Como administrador (Pro), quiero asignar usuarios a sedes, para controlar dónde opera cada quien.</w:t>
             </w:r>
           </w:p>
         </w:tc>
@@ -4581,12 +4268,6 @@
         </w:tc>
       </w:tr>
       <w:tr>
-        <w:tblPrEx>
-          <w:tblCellMar>
-            <w:top w:w="0" w:type="dxa"/>
-            <w:bottom w:w="0" w:type="dxa"/>
-          </w:tblCellMar>
-        </w:tblPrEx>
         <w:tc>
           <w:tcPr>
             <w:tcW w:w="760" w:type="dxa"/>
@@ -4714,12 +4395,6 @@
         </w:tc>
       </w:tr>
       <w:tr>
-        <w:tblPrEx>
-          <w:tblCellMar>
-            <w:top w:w="0" w:type="dxa"/>
-            <w:bottom w:w="0" w:type="dxa"/>
-          </w:tblCellMar>
-        </w:tblPrEx>
         <w:tc>
           <w:tcPr>
             <w:tcW w:w="760" w:type="dxa"/>
@@ -4846,12 +4521,6 @@
         </w:tc>
       </w:tr>
       <w:tr>
-        <w:tblPrEx>
-          <w:tblCellMar>
-            <w:top w:w="0" w:type="dxa"/>
-            <w:bottom w:w="0" w:type="dxa"/>
-          </w:tblCellMar>
-        </w:tblPrEx>
         <w:tc>
           <w:tcPr>
             <w:tcW w:w="760" w:type="dxa"/>
@@ -4978,12 +4647,6 @@
         </w:tc>
       </w:tr>
       <w:tr>
-        <w:tblPrEx>
-          <w:tblCellMar>
-            <w:top w:w="0" w:type="dxa"/>
-            <w:bottom w:w="0" w:type="dxa"/>
-          </w:tblCellMar>
-        </w:tblPrEx>
         <w:tc>
           <w:tcPr>
             <w:tcW w:w="760" w:type="dxa"/>
@@ -5110,12 +4773,6 @@
         </w:tc>
       </w:tr>
       <w:tr>
-        <w:tblPrEx>
-          <w:tblCellMar>
-            <w:top w:w="0" w:type="dxa"/>
-            <w:bottom w:w="0" w:type="dxa"/>
-          </w:tblCellMar>
-        </w:tblPrEx>
         <w:tc>
           <w:tcPr>
             <w:tcW w:w="760" w:type="dxa"/>
@@ -5242,12 +4899,6 @@
         </w:tc>
       </w:tr>
       <w:tr>
-        <w:tblPrEx>
-          <w:tblCellMar>
-            <w:top w:w="0" w:type="dxa"/>
-            <w:bottom w:w="0" w:type="dxa"/>
-          </w:tblCellMar>
-        </w:tblPrEx>
         <w:tc>
           <w:tcPr>
             <w:tcW w:w="760" w:type="dxa"/>
@@ -5374,12 +5025,6 @@
         </w:tc>
       </w:tr>
       <w:tr>
-        <w:tblPrEx>
-          <w:tblCellMar>
-            <w:top w:w="0" w:type="dxa"/>
-            <w:bottom w:w="0" w:type="dxa"/>
-          </w:tblCellMar>
-        </w:tblPrEx>
         <w:tc>
           <w:tcPr>
             <w:tcW w:w="760" w:type="dxa"/>
@@ -5506,12 +5151,6 @@
         </w:tc>
       </w:tr>
       <w:tr>
-        <w:tblPrEx>
-          <w:tblCellMar>
-            <w:top w:w="0" w:type="dxa"/>
-            <w:bottom w:w="0" w:type="dxa"/>
-          </w:tblCellMar>
-        </w:tblPrEx>
         <w:tc>
           <w:tcPr>
             <w:tcW w:w="760" w:type="dxa"/>
@@ -5638,12 +5277,6 @@
         </w:tc>
       </w:tr>
       <w:tr>
-        <w:tblPrEx>
-          <w:tblCellMar>
-            <w:top w:w="0" w:type="dxa"/>
-            <w:bottom w:w="0" w:type="dxa"/>
-          </w:tblCellMar>
-        </w:tblPrEx>
         <w:tc>
           <w:tcPr>
             <w:tcW w:w="760" w:type="dxa"/>
@@ -5770,12 +5403,6 @@
         </w:tc>
       </w:tr>
       <w:tr>
-        <w:tblPrEx>
-          <w:tblCellMar>
-            <w:top w:w="0" w:type="dxa"/>
-            <w:bottom w:w="0" w:type="dxa"/>
-          </w:tblCellMar>
-        </w:tblPrEx>
         <w:tc>
           <w:tcPr>
             <w:tcW w:w="760" w:type="dxa"/>
@@ -5902,12 +5529,6 @@
         </w:tc>
       </w:tr>
       <w:tr>
-        <w:tblPrEx>
-          <w:tblCellMar>
-            <w:top w:w="0" w:type="dxa"/>
-            <w:bottom w:w="0" w:type="dxa"/>
-          </w:tblCellMar>
-        </w:tblPrEx>
         <w:tc>
           <w:tcPr>
             <w:tcW w:w="760" w:type="dxa"/>
@@ -6034,12 +5655,6 @@
         </w:tc>
       </w:tr>
       <w:tr>
-        <w:tblPrEx>
-          <w:tblCellMar>
-            <w:top w:w="0" w:type="dxa"/>
-            <w:bottom w:w="0" w:type="dxa"/>
-          </w:tblCellMar>
-        </w:tblPrEx>
         <w:tc>
           <w:tcPr>
             <w:tcW w:w="760" w:type="dxa"/>
@@ -6166,12 +5781,6 @@
         </w:tc>
       </w:tr>
       <w:tr>
-        <w:tblPrEx>
-          <w:tblCellMar>
-            <w:top w:w="0" w:type="dxa"/>
-            <w:bottom w:w="0" w:type="dxa"/>
-          </w:tblCellMar>
-        </w:tblPrEx>
         <w:tc>
           <w:tcPr>
             <w:tcW w:w="760" w:type="dxa"/>
@@ -6240,23 +5849,7 @@
                 <w:sz w:val="17"/>
                 <w:szCs w:val="17"/>
               </w:rPr>
-              <w:t xml:space="preserve">Como plataforma INVENTRA, quiero registrar cada licorera como un </w:t>
-            </w:r>
-            <w:proofErr w:type="spellStart"/>
-            <w:r>
-              <w:rPr>
-                <w:sz w:val="17"/>
-                <w:szCs w:val="17"/>
-              </w:rPr>
-              <w:t>tenant</w:t>
-            </w:r>
-            <w:proofErr w:type="spellEnd"/>
-            <w:r>
-              <w:rPr>
-                <w:sz w:val="17"/>
-                <w:szCs w:val="17"/>
-              </w:rPr>
-              <w:t xml:space="preserve"> aislado, para separar sus datos.</w:t>
+              <w:t>Como plataforma INVENTRA, quiero registrar cada licorera como un tenant aislado, para separar sus datos.</w:t>
             </w:r>
           </w:p>
         </w:tc>
@@ -6314,12 +5907,6 @@
         </w:tc>
       </w:tr>
       <w:tr>
-        <w:tblPrEx>
-          <w:tblCellMar>
-            <w:top w:w="0" w:type="dxa"/>
-            <w:bottom w:w="0" w:type="dxa"/>
-          </w:tblCellMar>
-        </w:tblPrEx>
         <w:tc>
           <w:tcPr>
             <w:tcW w:w="760" w:type="dxa"/>
@@ -6446,12 +6033,6 @@
         </w:tc>
       </w:tr>
       <w:tr>
-        <w:tblPrEx>
-          <w:tblCellMar>
-            <w:top w:w="0" w:type="dxa"/>
-            <w:bottom w:w="0" w:type="dxa"/>
-          </w:tblCellMar>
-        </w:tblPrEx>
         <w:tc>
           <w:tcPr>
             <w:tcW w:w="760" w:type="dxa"/>
@@ -6578,12 +6159,6 @@
         </w:tc>
       </w:tr>
       <w:tr>
-        <w:tblPrEx>
-          <w:tblCellMar>
-            <w:top w:w="0" w:type="dxa"/>
-            <w:bottom w:w="0" w:type="dxa"/>
-          </w:tblCellMar>
-        </w:tblPrEx>
         <w:tc>
           <w:tcPr>
             <w:tcW w:w="760" w:type="dxa"/>
@@ -6710,12 +6285,6 @@
         </w:tc>
       </w:tr>
       <w:tr>
-        <w:tblPrEx>
-          <w:tblCellMar>
-            <w:top w:w="0" w:type="dxa"/>
-            <w:bottom w:w="0" w:type="dxa"/>
-          </w:tblCellMar>
-        </w:tblPrEx>
         <w:tc>
           <w:tcPr>
             <w:tcW w:w="760" w:type="dxa"/>
@@ -6842,12 +6411,6 @@
         </w:tc>
       </w:tr>
       <w:tr>
-        <w:tblPrEx>
-          <w:tblCellMar>
-            <w:top w:w="0" w:type="dxa"/>
-            <w:bottom w:w="0" w:type="dxa"/>
-          </w:tblCellMar>
-        </w:tblPrEx>
         <w:tc>
           <w:tcPr>
             <w:tcW w:w="760" w:type="dxa"/>
@@ -6974,12 +6537,6 @@
         </w:tc>
       </w:tr>
       <w:tr>
-        <w:tblPrEx>
-          <w:tblCellMar>
-            <w:top w:w="0" w:type="dxa"/>
-            <w:bottom w:w="0" w:type="dxa"/>
-          </w:tblCellMar>
-        </w:tblPrEx>
         <w:tc>
           <w:tcPr>
             <w:tcW w:w="760" w:type="dxa"/>
@@ -7106,12 +6663,6 @@
         </w:tc>
       </w:tr>
       <w:tr>
-        <w:tblPrEx>
-          <w:tblCellMar>
-            <w:top w:w="0" w:type="dxa"/>
-            <w:bottom w:w="0" w:type="dxa"/>
-          </w:tblCellMar>
-        </w:tblPrEx>
         <w:tc>
           <w:tcPr>
             <w:tcW w:w="760" w:type="dxa"/>
@@ -7238,12 +6789,6 @@
         </w:tc>
       </w:tr>
       <w:tr>
-        <w:tblPrEx>
-          <w:tblCellMar>
-            <w:top w:w="0" w:type="dxa"/>
-            <w:bottom w:w="0" w:type="dxa"/>
-          </w:tblCellMar>
-        </w:tblPrEx>
         <w:tc>
           <w:tcPr>
             <w:tcW w:w="760" w:type="dxa"/>
@@ -7375,21 +6920,12 @@
         <w:spacing w:after="120" w:line="264" w:lineRule="auto"/>
         <w:jc w:val="both"/>
       </w:pPr>
-      <w:proofErr w:type="gramStart"/>
       <w:r>
         <w:rPr>
           <w:b/>
           <w:bCs/>
         </w:rPr>
-        <w:t>Total</w:t>
-      </w:r>
-      <w:proofErr w:type="gramEnd"/>
-      <w:r>
-        <w:rPr>
-          <w:b/>
-          <w:bCs/>
-        </w:rPr>
-        <w:t xml:space="preserve"> de historias: </w:t>
+        <w:t xml:space="preserve">Total de historias: </w:t>
       </w:r>
       <w:r>
         <w:t>48.</w:t>
@@ -7645,15 +7181,7 @@
         <w:jc w:val="both"/>
       </w:pPr>
       <w:r>
-        <w:t xml:space="preserve">El movimiento queda registrado en el </w:t>
-      </w:r>
-      <w:proofErr w:type="spellStart"/>
-      <w:r>
-        <w:t>kardex</w:t>
-      </w:r>
-      <w:proofErr w:type="spellEnd"/>
-      <w:r>
-        <w:t xml:space="preserve"> del producto.</w:t>
+        <w:t>El movimiento queda registrado en el kardex del producto.</w:t>
       </w:r>
     </w:p>
     <w:p>
@@ -7949,15 +7477,7 @@
         <w:jc w:val="both"/>
       </w:pPr>
       <w:r>
-        <w:t xml:space="preserve">El plan Pro habilita además </w:t>
-      </w:r>
-      <w:proofErr w:type="spellStart"/>
-      <w:r>
-        <w:t>multisede</w:t>
-      </w:r>
-      <w:proofErr w:type="spellEnd"/>
-      <w:r>
-        <w:t>, reportes avanzados y facturación electrónica.</w:t>
+        <w:t>El plan Pro habilita además multisede, reportes avanzados y facturación electrónica.</w:t>
       </w:r>
     </w:p>
     <w:p>
@@ -8066,12 +7586,6 @@
         <w:gridCol w:w="1600"/>
       </w:tblGrid>
       <w:tr>
-        <w:tblPrEx>
-          <w:tblCellMar>
-            <w:top w:w="0" w:type="dxa"/>
-            <w:bottom w:w="0" w:type="dxa"/>
-          </w:tblCellMar>
-        </w:tblPrEx>
         <w:trPr>
           <w:tblHeader/>
         </w:trPr>
@@ -8158,12 +7672,6 @@
         </w:tc>
       </w:tr>
       <w:tr>
-        <w:tblPrEx>
-          <w:tblCellMar>
-            <w:top w:w="0" w:type="dxa"/>
-            <w:bottom w:w="0" w:type="dxa"/>
-          </w:tblCellMar>
-        </w:tblPrEx>
         <w:tc>
           <w:tcPr>
             <w:tcW w:w="560" w:type="dxa"/>
@@ -8241,12 +7749,6 @@
         </w:tc>
       </w:tr>
       <w:tr>
-        <w:tblPrEx>
-          <w:tblCellMar>
-            <w:top w:w="0" w:type="dxa"/>
-            <w:bottom w:w="0" w:type="dxa"/>
-          </w:tblCellMar>
-        </w:tblPrEx>
         <w:tc>
           <w:tcPr>
             <w:tcW w:w="560" w:type="dxa"/>
@@ -8324,12 +7826,6 @@
         </w:tc>
       </w:tr>
       <w:tr>
-        <w:tblPrEx>
-          <w:tblCellMar>
-            <w:top w:w="0" w:type="dxa"/>
-            <w:bottom w:w="0" w:type="dxa"/>
-          </w:tblCellMar>
-        </w:tblPrEx>
         <w:tc>
           <w:tcPr>
             <w:tcW w:w="560" w:type="dxa"/>
@@ -8374,23 +7870,7 @@
                 <w:sz w:val="18"/>
                 <w:szCs w:val="18"/>
               </w:rPr>
-              <w:t xml:space="preserve">Historias de usuario y </w:t>
-            </w:r>
-            <w:proofErr w:type="spellStart"/>
-            <w:r>
-              <w:rPr>
-                <w:sz w:val="18"/>
-                <w:szCs w:val="18"/>
-              </w:rPr>
-              <w:t>Product</w:t>
-            </w:r>
-            <w:proofErr w:type="spellEnd"/>
-            <w:r>
-              <w:rPr>
-                <w:sz w:val="18"/>
-                <w:szCs w:val="18"/>
-              </w:rPr>
-              <w:t xml:space="preserve"> Backlog</w:t>
+              <w:t>Historias de usuario y Product Backlog</w:t>
             </w:r>
           </w:p>
         </w:tc>
@@ -8423,12 +7903,6 @@
         </w:tc>
       </w:tr>
       <w:tr>
-        <w:tblPrEx>
-          <w:tblCellMar>
-            <w:top w:w="0" w:type="dxa"/>
-            <w:bottom w:w="0" w:type="dxa"/>
-          </w:tblCellMar>
-        </w:tblPrEx>
         <w:tc>
           <w:tcPr>
             <w:tcW w:w="560" w:type="dxa"/>
@@ -8506,12 +7980,6 @@
         </w:tc>
       </w:tr>
       <w:tr>
-        <w:tblPrEx>
-          <w:tblCellMar>
-            <w:top w:w="0" w:type="dxa"/>
-            <w:bottom w:w="0" w:type="dxa"/>
-          </w:tblCellMar>
-        </w:tblPrEx>
         <w:tc>
           <w:tcPr>
             <w:tcW w:w="560" w:type="dxa"/>
@@ -8556,17 +8024,8 @@
                 <w:sz w:val="18"/>
                 <w:szCs w:val="18"/>
               </w:rPr>
-              <w:t xml:space="preserve">Lean </w:t>
-            </w:r>
-            <w:proofErr w:type="spellStart"/>
-            <w:r>
-              <w:rPr>
-                <w:sz w:val="18"/>
-                <w:szCs w:val="18"/>
-              </w:rPr>
-              <w:t>Canvas</w:t>
-            </w:r>
-            <w:proofErr w:type="spellEnd"/>
+              <w:t>Lean Canvas</w:t>
+            </w:r>
           </w:p>
         </w:tc>
         <w:tc>
@@ -8598,12 +8057,6 @@
         </w:tc>
       </w:tr>
       <w:tr>
-        <w:tblPrEx>
-          <w:tblCellMar>
-            <w:top w:w="0" w:type="dxa"/>
-            <w:bottom w:w="0" w:type="dxa"/>
-          </w:tblCellMar>
-        </w:tblPrEx>
         <w:tc>
           <w:tcPr>
             <w:tcW w:w="560" w:type="dxa"/>
@@ -8648,23 +8101,7 @@
                 <w:sz w:val="18"/>
                 <w:szCs w:val="18"/>
               </w:rPr>
-              <w:t xml:space="preserve">Prototipo </w:t>
-            </w:r>
-            <w:proofErr w:type="spellStart"/>
-            <w:r>
-              <w:rPr>
-                <w:sz w:val="18"/>
-                <w:szCs w:val="18"/>
-              </w:rPr>
-              <w:t>Figma</w:t>
-            </w:r>
-            <w:proofErr w:type="spellEnd"/>
-            <w:r>
-              <w:rPr>
-                <w:sz w:val="18"/>
-                <w:szCs w:val="18"/>
-              </w:rPr>
-              <w:t xml:space="preserve"> (web y móvil)</w:t>
+              <w:t>Prototipo Figma (web y móvil)</w:t>
             </w:r>
           </w:p>
         </w:tc>
@@ -8697,12 +8134,6 @@
         </w:tc>
       </w:tr>
       <w:tr>
-        <w:tblPrEx>
-          <w:tblCellMar>
-            <w:top w:w="0" w:type="dxa"/>
-            <w:bottom w:w="0" w:type="dxa"/>
-          </w:tblCellMar>
-        </w:tblPrEx>
         <w:tc>
           <w:tcPr>
             <w:tcW w:w="560" w:type="dxa"/>
@@ -8780,12 +8211,6 @@
         </w:tc>
       </w:tr>
       <w:tr>
-        <w:tblPrEx>
-          <w:tblCellMar>
-            <w:top w:w="0" w:type="dxa"/>
-            <w:bottom w:w="0" w:type="dxa"/>
-          </w:tblCellMar>
-        </w:tblPrEx>
         <w:tc>
           <w:tcPr>
             <w:tcW w:w="560" w:type="dxa"/>
@@ -8863,12 +8288,6 @@
         </w:tc>
       </w:tr>
       <w:tr>
-        <w:tblPrEx>
-          <w:tblCellMar>
-            <w:top w:w="0" w:type="dxa"/>
-            <w:bottom w:w="0" w:type="dxa"/>
-          </w:tblCellMar>
-        </w:tblPrEx>
         <w:tc>
           <w:tcPr>
             <w:tcW w:w="560" w:type="dxa"/>
@@ -8946,12 +8365,6 @@
         </w:tc>
       </w:tr>
       <w:tr>
-        <w:tblPrEx>
-          <w:tblCellMar>
-            <w:top w:w="0" w:type="dxa"/>
-            <w:bottom w:w="0" w:type="dxa"/>
-          </w:tblCellMar>
-        </w:tblPrEx>
         <w:tc>
           <w:tcPr>
             <w:tcW w:w="560" w:type="dxa"/>
@@ -9095,12 +8508,6 @@
         <w:gridCol w:w="7460"/>
       </w:tblGrid>
       <w:tr>
-        <w:tblPrEx>
-          <w:tblCellMar>
-            <w:top w:w="0" w:type="dxa"/>
-            <w:bottom w:w="0" w:type="dxa"/>
-          </w:tblCellMar>
-        </w:tblPrEx>
         <w:trPr>
           <w:tblHeader/>
         </w:trPr>
@@ -9160,12 +8567,6 @@
         </w:tc>
       </w:tr>
       <w:tr>
-        <w:tblPrEx>
-          <w:tblCellMar>
-            <w:top w:w="0" w:type="dxa"/>
-            <w:bottom w:w="0" w:type="dxa"/>
-          </w:tblCellMar>
-        </w:tblPrEx>
         <w:tc>
           <w:tcPr>
             <w:tcW w:w="1900" w:type="dxa"/>
@@ -9210,82 +8611,212 @@
                 <w:sz w:val="18"/>
                 <w:szCs w:val="18"/>
               </w:rPr>
-              <w:t xml:space="preserve">Modelos de usuario y rol; </w:t>
-            </w:r>
-            <w:proofErr w:type="spellStart"/>
+              <w:t>Modelos de usuario y rol; endpoints de registro, login, logout y recuperación; autenticación y sesión segura; permisos por rol; interfaces de login/registro/perfil; pruebas.</w:t>
+            </w:r>
+          </w:p>
+        </w:tc>
+      </w:tr>
+      <w:tr>
+        <w:tc>
+          <w:tcPr>
+            <w:tcW w:w="1900" w:type="dxa"/>
+            <w:shd w:val="clear" w:color="auto" w:fill="F2F2F2"/>
+            <w:tcMar>
+              <w:top w:w="40" w:type="dxa"/>
+              <w:left w:w="70" w:type="dxa"/>
+              <w:bottom w:w="40" w:type="dxa"/>
+              <w:right w:w="70" w:type="dxa"/>
+            </w:tcMar>
+          </w:tcPr>
+          <w:p>
+            <w:pPr>
+              <w:spacing w:line="230" w:lineRule="auto"/>
+            </w:pPr>
             <w:r>
               <w:rPr>
                 <w:sz w:val="18"/>
                 <w:szCs w:val="18"/>
               </w:rPr>
-              <w:t>endpoints</w:t>
-            </w:r>
-            <w:proofErr w:type="spellEnd"/>
+              <w:t>SUS · Suscripciones</w:t>
+            </w:r>
+          </w:p>
+        </w:tc>
+        <w:tc>
+          <w:tcPr>
+            <w:tcW w:w="7460" w:type="dxa"/>
+            <w:shd w:val="clear" w:color="auto" w:fill="F2F2F2"/>
+            <w:tcMar>
+              <w:top w:w="40" w:type="dxa"/>
+              <w:left w:w="70" w:type="dxa"/>
+              <w:bottom w:w="40" w:type="dxa"/>
+              <w:right w:w="70" w:type="dxa"/>
+            </w:tcMar>
+          </w:tcPr>
+          <w:p>
+            <w:pPr>
+              <w:spacing w:line="230" w:lineRule="auto"/>
+            </w:pPr>
             <w:r>
               <w:rPr>
                 <w:sz w:val="18"/>
                 <w:szCs w:val="18"/>
               </w:rPr>
-              <w:t xml:space="preserve"> de registro, </w:t>
-            </w:r>
-            <w:proofErr w:type="spellStart"/>
+              <w:t>Modelos de plan, licorera y suscripción; aislamiento por licorera (multitenant); cambio de plan y control de estado; restricción de funciones por plan; panel de superadministración; pruebas.</w:t>
+            </w:r>
+          </w:p>
+        </w:tc>
+      </w:tr>
+      <w:tr>
+        <w:tc>
+          <w:tcPr>
+            <w:tcW w:w="1900" w:type="dxa"/>
+            <w:shd w:val="clear" w:color="auto" w:fill="FFFFFF"/>
+            <w:tcMar>
+              <w:top w:w="40" w:type="dxa"/>
+              <w:left w:w="70" w:type="dxa"/>
+              <w:bottom w:w="40" w:type="dxa"/>
+              <w:right w:w="70" w:type="dxa"/>
+            </w:tcMar>
+          </w:tcPr>
+          <w:p>
+            <w:pPr>
+              <w:spacing w:line="230" w:lineRule="auto"/>
+            </w:pPr>
             <w:r>
               <w:rPr>
                 <w:sz w:val="18"/>
                 <w:szCs w:val="18"/>
               </w:rPr>
-              <w:t>login</w:t>
-            </w:r>
-            <w:proofErr w:type="spellEnd"/>
+              <w:t>INV · Inventario</w:t>
+            </w:r>
+          </w:p>
+        </w:tc>
+        <w:tc>
+          <w:tcPr>
+            <w:tcW w:w="7460" w:type="dxa"/>
+            <w:shd w:val="clear" w:color="auto" w:fill="FFFFFF"/>
+            <w:tcMar>
+              <w:top w:w="40" w:type="dxa"/>
+              <w:left w:w="70" w:type="dxa"/>
+              <w:bottom w:w="40" w:type="dxa"/>
+              <w:right w:w="70" w:type="dxa"/>
+            </w:tcMar>
+          </w:tcPr>
+          <w:p>
+            <w:pPr>
+              <w:spacing w:line="230" w:lineRule="auto"/>
+            </w:pPr>
             <w:r>
               <w:rPr>
                 <w:sz w:val="18"/>
                 <w:szCs w:val="18"/>
               </w:rPr>
-              <w:t xml:space="preserve">, </w:t>
-            </w:r>
-            <w:proofErr w:type="spellStart"/>
+              <w:t>Modelos de producto, categoría, lote y movimiento; CRUD de productos; entrada por lote; lógica de valoración PEPS y consumo de lotes; alertas de stock; kardex; interfaz de inventario; pruebas.</w:t>
+            </w:r>
+          </w:p>
+        </w:tc>
+      </w:tr>
+      <w:tr>
+        <w:tc>
+          <w:tcPr>
+            <w:tcW w:w="1900" w:type="dxa"/>
+            <w:shd w:val="clear" w:color="auto" w:fill="F2F2F2"/>
+            <w:tcMar>
+              <w:top w:w="40" w:type="dxa"/>
+              <w:left w:w="70" w:type="dxa"/>
+              <w:bottom w:w="40" w:type="dxa"/>
+              <w:right w:w="70" w:type="dxa"/>
+            </w:tcMar>
+          </w:tcPr>
+          <w:p>
+            <w:pPr>
+              <w:spacing w:line="230" w:lineRule="auto"/>
+            </w:pPr>
             <w:r>
               <w:rPr>
                 <w:sz w:val="18"/>
                 <w:szCs w:val="18"/>
               </w:rPr>
-              <w:t>logout</w:t>
-            </w:r>
-            <w:proofErr w:type="spellEnd"/>
+              <w:t>VEN · Ventas (POS)</w:t>
+            </w:r>
+          </w:p>
+        </w:tc>
+        <w:tc>
+          <w:tcPr>
+            <w:tcW w:w="7460" w:type="dxa"/>
+            <w:shd w:val="clear" w:color="auto" w:fill="F2F2F2"/>
+            <w:tcMar>
+              <w:top w:w="40" w:type="dxa"/>
+              <w:left w:w="70" w:type="dxa"/>
+              <w:bottom w:w="40" w:type="dxa"/>
+              <w:right w:w="70" w:type="dxa"/>
+            </w:tcMar>
+          </w:tcPr>
+          <w:p>
+            <w:pPr>
+              <w:spacing w:line="230" w:lineRule="auto"/>
+            </w:pPr>
             <w:r>
               <w:rPr>
                 <w:sz w:val="18"/>
                 <w:szCs w:val="18"/>
               </w:rPr>
-              <w:t xml:space="preserve"> y recuperación; autenticación y sesión segura; permisos por rol; interfaces de </w:t>
-            </w:r>
-            <w:proofErr w:type="spellStart"/>
+              <w:t>Modelos de venta, detalle, consumo de lote y medio de pago; registro de venta con descuento de stock y PEPS; comprobante; anulación; cierre de caja; interfaz del punto de venta; pruebas.</w:t>
+            </w:r>
+          </w:p>
+        </w:tc>
+      </w:tr>
+      <w:tr>
+        <w:tc>
+          <w:tcPr>
+            <w:tcW w:w="1900" w:type="dxa"/>
+            <w:shd w:val="clear" w:color="auto" w:fill="FFFFFF"/>
+            <w:tcMar>
+              <w:top w:w="40" w:type="dxa"/>
+              <w:left w:w="70" w:type="dxa"/>
+              <w:bottom w:w="40" w:type="dxa"/>
+              <w:right w:w="70" w:type="dxa"/>
+            </w:tcMar>
+          </w:tcPr>
+          <w:p>
+            <w:pPr>
+              <w:spacing w:line="230" w:lineRule="auto"/>
+            </w:pPr>
             <w:r>
               <w:rPr>
                 <w:sz w:val="18"/>
                 <w:szCs w:val="18"/>
               </w:rPr>
-              <w:t>login</w:t>
-            </w:r>
-            <w:proofErr w:type="spellEnd"/>
+              <w:t>REP · Reportes</w:t>
+            </w:r>
+          </w:p>
+        </w:tc>
+        <w:tc>
+          <w:tcPr>
+            <w:tcW w:w="7460" w:type="dxa"/>
+            <w:shd w:val="clear" w:color="auto" w:fill="FFFFFF"/>
+            <w:tcMar>
+              <w:top w:w="40" w:type="dxa"/>
+              <w:left w:w="70" w:type="dxa"/>
+              <w:bottom w:w="40" w:type="dxa"/>
+              <w:right w:w="70" w:type="dxa"/>
+            </w:tcMar>
+          </w:tcPr>
+          <w:p>
+            <w:pPr>
+              <w:spacing w:line="230" w:lineRule="auto"/>
+            </w:pPr>
             <w:r>
               <w:rPr>
                 <w:sz w:val="18"/>
                 <w:szCs w:val="18"/>
               </w:rPr>
-              <w:t>/registro/perfil; pruebas.</w:t>
+              <w:t>Consultas y agregaciones; endpoints de reportes (ventas, inventario, rotación, utilidad); exportación; interfaz de reportes y gráficas; pruebas.</w:t>
             </w:r>
           </w:p>
         </w:tc>
       </w:tr>
       <w:tr>
-        <w:tblPrEx>
-          <w:tblCellMar>
-            <w:top w:w="0" w:type="dxa"/>
-            <w:bottom w:w="0" w:type="dxa"/>
-          </w:tblCellMar>
-        </w:tblPrEx>
         <w:tc>
           <w:tcPr>
             <w:tcW w:w="1900" w:type="dxa"/>
@@ -9306,7 +8837,7 @@
                 <w:sz w:val="18"/>
                 <w:szCs w:val="18"/>
               </w:rPr>
-              <w:t>SUS · Suscripciones</w:t>
+              <w:t>SED · Multisede</w:t>
             </w:r>
           </w:p>
         </w:tc>
@@ -9330,403 +8861,62 @@
                 <w:sz w:val="18"/>
                 <w:szCs w:val="18"/>
               </w:rPr>
-              <w:t>Modelos de plan, licorera y suscripción; aislamiento por licorera (</w:t>
-            </w:r>
-            <w:proofErr w:type="spellStart"/>
+              <w:t>Modelos de sede y traslado; gestión de sedes; asignación de usuarios; inventario por sede; traslados entre sedes; interfaz multisede; pruebas.</w:t>
+            </w:r>
+          </w:p>
+        </w:tc>
+      </w:tr>
+      <w:tr>
+        <w:tc>
+          <w:tcPr>
+            <w:tcW w:w="1900" w:type="dxa"/>
+            <w:shd w:val="clear" w:color="auto" w:fill="FFFFFF"/>
+            <w:tcMar>
+              <w:top w:w="40" w:type="dxa"/>
+              <w:left w:w="70" w:type="dxa"/>
+              <w:bottom w:w="40" w:type="dxa"/>
+              <w:right w:w="70" w:type="dxa"/>
+            </w:tcMar>
+          </w:tcPr>
+          <w:p>
+            <w:pPr>
+              <w:spacing w:line="230" w:lineRule="auto"/>
+            </w:pPr>
             <w:r>
               <w:rPr>
                 <w:sz w:val="18"/>
                 <w:szCs w:val="18"/>
               </w:rPr>
-              <w:t>multitenant</w:t>
-            </w:r>
-            <w:proofErr w:type="spellEnd"/>
+              <w:t>FAC · Facturación</w:t>
+            </w:r>
+          </w:p>
+        </w:tc>
+        <w:tc>
+          <w:tcPr>
+            <w:tcW w:w="7460" w:type="dxa"/>
+            <w:shd w:val="clear" w:color="auto" w:fill="FFFFFF"/>
+            <w:tcMar>
+              <w:top w:w="40" w:type="dxa"/>
+              <w:left w:w="70" w:type="dxa"/>
+              <w:bottom w:w="40" w:type="dxa"/>
+              <w:right w:w="70" w:type="dxa"/>
+            </w:tcMar>
+          </w:tcPr>
+          <w:p>
+            <w:pPr>
+              <w:spacing w:line="230" w:lineRule="auto"/>
+            </w:pPr>
             <w:r>
               <w:rPr>
                 <w:sz w:val="18"/>
                 <w:szCs w:val="18"/>
               </w:rPr>
-              <w:t xml:space="preserve">); cambio de plan y control de estado; restricción de funciones por plan; panel de </w:t>
-            </w:r>
-            <w:proofErr w:type="spellStart"/>
-            <w:r>
-              <w:rPr>
-                <w:sz w:val="18"/>
-                <w:szCs w:val="18"/>
-              </w:rPr>
-              <w:t>superadministración</w:t>
-            </w:r>
-            <w:proofErr w:type="spellEnd"/>
-            <w:r>
-              <w:rPr>
-                <w:sz w:val="18"/>
-                <w:szCs w:val="18"/>
-              </w:rPr>
-              <w:t>; pruebas.</w:t>
+              <w:t>Configuración de datos fiscales; integración con proveedor DIAN (sandbox); emisión de factura y nota crédito; consulta y reenvío; interfaz de facturación; pruebas.</w:t>
             </w:r>
           </w:p>
         </w:tc>
       </w:tr>
       <w:tr>
-        <w:tblPrEx>
-          <w:tblCellMar>
-            <w:top w:w="0" w:type="dxa"/>
-            <w:bottom w:w="0" w:type="dxa"/>
-          </w:tblCellMar>
-        </w:tblPrEx>
-        <w:tc>
-          <w:tcPr>
-            <w:tcW w:w="1900" w:type="dxa"/>
-            <w:shd w:val="clear" w:color="auto" w:fill="FFFFFF"/>
-            <w:tcMar>
-              <w:top w:w="40" w:type="dxa"/>
-              <w:left w:w="70" w:type="dxa"/>
-              <w:bottom w:w="40" w:type="dxa"/>
-              <w:right w:w="70" w:type="dxa"/>
-            </w:tcMar>
-          </w:tcPr>
-          <w:p>
-            <w:pPr>
-              <w:spacing w:line="230" w:lineRule="auto"/>
-            </w:pPr>
-            <w:r>
-              <w:rPr>
-                <w:sz w:val="18"/>
-                <w:szCs w:val="18"/>
-              </w:rPr>
-              <w:t>INV · Inventario</w:t>
-            </w:r>
-          </w:p>
-        </w:tc>
-        <w:tc>
-          <w:tcPr>
-            <w:tcW w:w="7460" w:type="dxa"/>
-            <w:shd w:val="clear" w:color="auto" w:fill="FFFFFF"/>
-            <w:tcMar>
-              <w:top w:w="40" w:type="dxa"/>
-              <w:left w:w="70" w:type="dxa"/>
-              <w:bottom w:w="40" w:type="dxa"/>
-              <w:right w:w="70" w:type="dxa"/>
-            </w:tcMar>
-          </w:tcPr>
-          <w:p>
-            <w:pPr>
-              <w:spacing w:line="230" w:lineRule="auto"/>
-            </w:pPr>
-            <w:r>
-              <w:rPr>
-                <w:sz w:val="18"/>
-                <w:szCs w:val="18"/>
-              </w:rPr>
-              <w:t xml:space="preserve">Modelos de producto, categoría, lote y movimiento; CRUD de productos; entrada por lote; lógica de valoración PEPS y consumo de lotes; alertas de stock; </w:t>
-            </w:r>
-            <w:proofErr w:type="spellStart"/>
-            <w:r>
-              <w:rPr>
-                <w:sz w:val="18"/>
-                <w:szCs w:val="18"/>
-              </w:rPr>
-              <w:t>kardex</w:t>
-            </w:r>
-            <w:proofErr w:type="spellEnd"/>
-            <w:r>
-              <w:rPr>
-                <w:sz w:val="18"/>
-                <w:szCs w:val="18"/>
-              </w:rPr>
-              <w:t>; interfaz de inventario; pruebas.</w:t>
-            </w:r>
-          </w:p>
-        </w:tc>
-      </w:tr>
-      <w:tr>
-        <w:tblPrEx>
-          <w:tblCellMar>
-            <w:top w:w="0" w:type="dxa"/>
-            <w:bottom w:w="0" w:type="dxa"/>
-          </w:tblCellMar>
-        </w:tblPrEx>
-        <w:tc>
-          <w:tcPr>
-            <w:tcW w:w="1900" w:type="dxa"/>
-            <w:shd w:val="clear" w:color="auto" w:fill="F2F2F2"/>
-            <w:tcMar>
-              <w:top w:w="40" w:type="dxa"/>
-              <w:left w:w="70" w:type="dxa"/>
-              <w:bottom w:w="40" w:type="dxa"/>
-              <w:right w:w="70" w:type="dxa"/>
-            </w:tcMar>
-          </w:tcPr>
-          <w:p>
-            <w:pPr>
-              <w:spacing w:line="230" w:lineRule="auto"/>
-            </w:pPr>
-            <w:r>
-              <w:rPr>
-                <w:sz w:val="18"/>
-                <w:szCs w:val="18"/>
-              </w:rPr>
-              <w:t>VEN · Ventas (POS)</w:t>
-            </w:r>
-          </w:p>
-        </w:tc>
-        <w:tc>
-          <w:tcPr>
-            <w:tcW w:w="7460" w:type="dxa"/>
-            <w:shd w:val="clear" w:color="auto" w:fill="F2F2F2"/>
-            <w:tcMar>
-              <w:top w:w="40" w:type="dxa"/>
-              <w:left w:w="70" w:type="dxa"/>
-              <w:bottom w:w="40" w:type="dxa"/>
-              <w:right w:w="70" w:type="dxa"/>
-            </w:tcMar>
-          </w:tcPr>
-          <w:p>
-            <w:pPr>
-              <w:spacing w:line="230" w:lineRule="auto"/>
-            </w:pPr>
-            <w:r>
-              <w:rPr>
-                <w:sz w:val="18"/>
-                <w:szCs w:val="18"/>
-              </w:rPr>
-              <w:t>Modelos de venta, detalle, consumo de lote y medio de pago; registro de venta con descuento de stock y PEPS; comprobante; anulación; cierre de caja; interfaz del punto de venta; pruebas.</w:t>
-            </w:r>
-          </w:p>
-        </w:tc>
-      </w:tr>
-      <w:tr>
-        <w:tblPrEx>
-          <w:tblCellMar>
-            <w:top w:w="0" w:type="dxa"/>
-            <w:bottom w:w="0" w:type="dxa"/>
-          </w:tblCellMar>
-        </w:tblPrEx>
-        <w:tc>
-          <w:tcPr>
-            <w:tcW w:w="1900" w:type="dxa"/>
-            <w:shd w:val="clear" w:color="auto" w:fill="FFFFFF"/>
-            <w:tcMar>
-              <w:top w:w="40" w:type="dxa"/>
-              <w:left w:w="70" w:type="dxa"/>
-              <w:bottom w:w="40" w:type="dxa"/>
-              <w:right w:w="70" w:type="dxa"/>
-            </w:tcMar>
-          </w:tcPr>
-          <w:p>
-            <w:pPr>
-              <w:spacing w:line="230" w:lineRule="auto"/>
-            </w:pPr>
-            <w:r>
-              <w:rPr>
-                <w:sz w:val="18"/>
-                <w:szCs w:val="18"/>
-              </w:rPr>
-              <w:t>REP · Reportes</w:t>
-            </w:r>
-          </w:p>
-        </w:tc>
-        <w:tc>
-          <w:tcPr>
-            <w:tcW w:w="7460" w:type="dxa"/>
-            <w:shd w:val="clear" w:color="auto" w:fill="FFFFFF"/>
-            <w:tcMar>
-              <w:top w:w="40" w:type="dxa"/>
-              <w:left w:w="70" w:type="dxa"/>
-              <w:bottom w:w="40" w:type="dxa"/>
-              <w:right w:w="70" w:type="dxa"/>
-            </w:tcMar>
-          </w:tcPr>
-          <w:p>
-            <w:pPr>
-              <w:spacing w:line="230" w:lineRule="auto"/>
-            </w:pPr>
-            <w:r>
-              <w:rPr>
-                <w:sz w:val="18"/>
-                <w:szCs w:val="18"/>
-              </w:rPr>
-              <w:t xml:space="preserve">Consultas y agregaciones; </w:t>
-            </w:r>
-            <w:proofErr w:type="spellStart"/>
-            <w:r>
-              <w:rPr>
-                <w:sz w:val="18"/>
-                <w:szCs w:val="18"/>
-              </w:rPr>
-              <w:t>endpoints</w:t>
-            </w:r>
-            <w:proofErr w:type="spellEnd"/>
-            <w:r>
-              <w:rPr>
-                <w:sz w:val="18"/>
-                <w:szCs w:val="18"/>
-              </w:rPr>
-              <w:t xml:space="preserve"> de reportes (ventas, inventario, rotación, utilidad); exportación; interfaz de reportes y gráficas; pruebas.</w:t>
-            </w:r>
-          </w:p>
-        </w:tc>
-      </w:tr>
-      <w:tr>
-        <w:tblPrEx>
-          <w:tblCellMar>
-            <w:top w:w="0" w:type="dxa"/>
-            <w:bottom w:w="0" w:type="dxa"/>
-          </w:tblCellMar>
-        </w:tblPrEx>
-        <w:tc>
-          <w:tcPr>
-            <w:tcW w:w="1900" w:type="dxa"/>
-            <w:shd w:val="clear" w:color="auto" w:fill="F2F2F2"/>
-            <w:tcMar>
-              <w:top w:w="40" w:type="dxa"/>
-              <w:left w:w="70" w:type="dxa"/>
-              <w:bottom w:w="40" w:type="dxa"/>
-              <w:right w:w="70" w:type="dxa"/>
-            </w:tcMar>
-          </w:tcPr>
-          <w:p>
-            <w:pPr>
-              <w:spacing w:line="230" w:lineRule="auto"/>
-            </w:pPr>
-            <w:r>
-              <w:rPr>
-                <w:sz w:val="18"/>
-                <w:szCs w:val="18"/>
-              </w:rPr>
-              <w:t xml:space="preserve">SED · </w:t>
-            </w:r>
-            <w:proofErr w:type="spellStart"/>
-            <w:r>
-              <w:rPr>
-                <w:sz w:val="18"/>
-                <w:szCs w:val="18"/>
-              </w:rPr>
-              <w:t>Multisede</w:t>
-            </w:r>
-            <w:proofErr w:type="spellEnd"/>
-          </w:p>
-        </w:tc>
-        <w:tc>
-          <w:tcPr>
-            <w:tcW w:w="7460" w:type="dxa"/>
-            <w:shd w:val="clear" w:color="auto" w:fill="F2F2F2"/>
-            <w:tcMar>
-              <w:top w:w="40" w:type="dxa"/>
-              <w:left w:w="70" w:type="dxa"/>
-              <w:bottom w:w="40" w:type="dxa"/>
-              <w:right w:w="70" w:type="dxa"/>
-            </w:tcMar>
-          </w:tcPr>
-          <w:p>
-            <w:pPr>
-              <w:spacing w:line="230" w:lineRule="auto"/>
-            </w:pPr>
-            <w:r>
-              <w:rPr>
-                <w:sz w:val="18"/>
-                <w:szCs w:val="18"/>
-              </w:rPr>
-              <w:t xml:space="preserve">Modelos de sede y traslado; gestión de sedes; asignación de usuarios; inventario por sede; traslados entre sedes; interfaz </w:t>
-            </w:r>
-            <w:proofErr w:type="spellStart"/>
-            <w:r>
-              <w:rPr>
-                <w:sz w:val="18"/>
-                <w:szCs w:val="18"/>
-              </w:rPr>
-              <w:t>multisede</w:t>
-            </w:r>
-            <w:proofErr w:type="spellEnd"/>
-            <w:r>
-              <w:rPr>
-                <w:sz w:val="18"/>
-                <w:szCs w:val="18"/>
-              </w:rPr>
-              <w:t>; pruebas.</w:t>
-            </w:r>
-          </w:p>
-        </w:tc>
-      </w:tr>
-      <w:tr>
-        <w:tblPrEx>
-          <w:tblCellMar>
-            <w:top w:w="0" w:type="dxa"/>
-            <w:bottom w:w="0" w:type="dxa"/>
-          </w:tblCellMar>
-        </w:tblPrEx>
-        <w:tc>
-          <w:tcPr>
-            <w:tcW w:w="1900" w:type="dxa"/>
-            <w:shd w:val="clear" w:color="auto" w:fill="FFFFFF"/>
-            <w:tcMar>
-              <w:top w:w="40" w:type="dxa"/>
-              <w:left w:w="70" w:type="dxa"/>
-              <w:bottom w:w="40" w:type="dxa"/>
-              <w:right w:w="70" w:type="dxa"/>
-            </w:tcMar>
-          </w:tcPr>
-          <w:p>
-            <w:pPr>
-              <w:spacing w:line="230" w:lineRule="auto"/>
-            </w:pPr>
-            <w:r>
-              <w:rPr>
-                <w:sz w:val="18"/>
-                <w:szCs w:val="18"/>
-              </w:rPr>
-              <w:t>FAC · Facturación</w:t>
-            </w:r>
-          </w:p>
-        </w:tc>
-        <w:tc>
-          <w:tcPr>
-            <w:tcW w:w="7460" w:type="dxa"/>
-            <w:shd w:val="clear" w:color="auto" w:fill="FFFFFF"/>
-            <w:tcMar>
-              <w:top w:w="40" w:type="dxa"/>
-              <w:left w:w="70" w:type="dxa"/>
-              <w:bottom w:w="40" w:type="dxa"/>
-              <w:right w:w="70" w:type="dxa"/>
-            </w:tcMar>
-          </w:tcPr>
-          <w:p>
-            <w:pPr>
-              <w:spacing w:line="230" w:lineRule="auto"/>
-            </w:pPr>
-            <w:r>
-              <w:rPr>
-                <w:sz w:val="18"/>
-                <w:szCs w:val="18"/>
-              </w:rPr>
-              <w:t>Configuración de datos fiscales; integración con proveedor DIAN (</w:t>
-            </w:r>
-            <w:proofErr w:type="spellStart"/>
-            <w:r>
-              <w:rPr>
-                <w:sz w:val="18"/>
-                <w:szCs w:val="18"/>
-              </w:rPr>
-              <w:t>sandbox</w:t>
-            </w:r>
-            <w:proofErr w:type="spellEnd"/>
-            <w:r>
-              <w:rPr>
-                <w:sz w:val="18"/>
-                <w:szCs w:val="18"/>
-              </w:rPr>
-              <w:t>); emisión de factura y nota crédito; consulta y reenvío; interfaz de facturación; pruebas.</w:t>
-            </w:r>
-          </w:p>
-        </w:tc>
-      </w:tr>
-      <w:tr>
-        <w:tblPrEx>
-          <w:tblCellMar>
-            <w:top w:w="0" w:type="dxa"/>
-            <w:bottom w:w="0" w:type="dxa"/>
-          </w:tblCellMar>
-        </w:tblPrEx>
         <w:tc>
           <w:tcPr>
             <w:tcW w:w="1900" w:type="dxa"/>
@@ -9792,29 +8982,7 @@
           <w:szCs w:val="28"/>
         </w:rPr>
         <w:lastRenderedPageBreak/>
-        <w:t xml:space="preserve">8. Plan de </w:t>
-      </w:r>
-      <w:proofErr w:type="spellStart"/>
-      <w:r>
-        <w:rPr>
-          <w:b/>
-          <w:bCs/>
-          <w:color w:val="1F3864"/>
-          <w:sz w:val="28"/>
-          <w:szCs w:val="28"/>
-        </w:rPr>
-        <w:t>sprints</w:t>
-      </w:r>
-      <w:proofErr w:type="spellEnd"/>
-      <w:r>
-        <w:rPr>
-          <w:b/>
-          <w:bCs/>
-          <w:color w:val="1F3864"/>
-          <w:sz w:val="28"/>
-          <w:szCs w:val="28"/>
-        </w:rPr>
-        <w:t xml:space="preserve"> (proyección)</w:t>
+        <w:t>8. Plan de sprints (proyección)</w:t>
       </w:r>
     </w:p>
     <w:p>
@@ -9822,21 +8990,8 @@
         <w:spacing w:after="120" w:line="264" w:lineRule="auto"/>
         <w:jc w:val="both"/>
       </w:pPr>
-      <w:proofErr w:type="spellStart"/>
-      <w:r>
-        <w:t>Sprints</w:t>
-      </w:r>
-      <w:proofErr w:type="spellEnd"/>
-      <w:r>
-        <w:t xml:space="preserve"> de dos (2) semanas. El Sprint 0 es la fase de diseño (actual). Los </w:t>
-      </w:r>
-      <w:proofErr w:type="spellStart"/>
-      <w:r>
-        <w:t>sprints</w:t>
-      </w:r>
-      <w:proofErr w:type="spellEnd"/>
-      <w:r>
-        <w:t xml:space="preserve"> de construcción siguen un orden lógico por módulo y se ejecutan tras la aprobación.</w:t>
+      <w:r>
+        <w:t>Sprints de dos (2) semanas. El Sprint 0 es la fase de diseño (actual). Los sprints de construcción siguen un orden lógico por módulo y se ejecutan tras la aprobación.</w:t>
       </w:r>
     </w:p>
     <w:tbl>
@@ -9863,12 +9018,6 @@
         <w:gridCol w:w="7040"/>
       </w:tblGrid>
       <w:tr>
-        <w:tblPrEx>
-          <w:tblCellMar>
-            <w:top w:w="0" w:type="dxa"/>
-            <w:bottom w:w="0" w:type="dxa"/>
-          </w:tblCellMar>
-        </w:tblPrEx>
         <w:trPr>
           <w:tblHeader/>
         </w:trPr>
@@ -9955,12 +9104,6 @@
         </w:tc>
       </w:tr>
       <w:tr>
-        <w:tblPrEx>
-          <w:tblCellMar>
-            <w:top w:w="0" w:type="dxa"/>
-            <w:bottom w:w="0" w:type="dxa"/>
-          </w:tblCellMar>
-        </w:tblPrEx>
         <w:tc>
           <w:tcPr>
             <w:tcW w:w="820" w:type="dxa"/>
@@ -10029,50 +9172,160 @@
                 <w:sz w:val="18"/>
                 <w:szCs w:val="18"/>
               </w:rPr>
-              <w:t xml:space="preserve">Análisis y diseño: mapa de empatía, Lean </w:t>
-            </w:r>
-            <w:proofErr w:type="spellStart"/>
+              <w:t>Análisis y diseño: mapa de empatía, Lean Canvas, prototipo Figma, UML, documento de diseño, Brand Book y propuesta técnica (historias de usuario ya hechas).</w:t>
+            </w:r>
+          </w:p>
+        </w:tc>
+      </w:tr>
+      <w:tr>
+        <w:tc>
+          <w:tcPr>
+            <w:tcW w:w="820" w:type="dxa"/>
+            <w:shd w:val="clear" w:color="auto" w:fill="F2F2F2"/>
+            <w:tcMar>
+              <w:top w:w="40" w:type="dxa"/>
+              <w:left w:w="70" w:type="dxa"/>
+              <w:bottom w:w="40" w:type="dxa"/>
+              <w:right w:w="70" w:type="dxa"/>
+            </w:tcMar>
+          </w:tcPr>
+          <w:p>
+            <w:pPr>
+              <w:spacing w:line="230" w:lineRule="auto"/>
+            </w:pPr>
             <w:r>
               <w:rPr>
                 <w:sz w:val="18"/>
                 <w:szCs w:val="18"/>
               </w:rPr>
-              <w:t>Canvas</w:t>
-            </w:r>
-            <w:proofErr w:type="spellEnd"/>
+              <w:t>1</w:t>
+            </w:r>
+          </w:p>
+        </w:tc>
+        <w:tc>
+          <w:tcPr>
+            <w:tcW w:w="1500" w:type="dxa"/>
+            <w:shd w:val="clear" w:color="auto" w:fill="F2F2F2"/>
+            <w:tcMar>
+              <w:top w:w="40" w:type="dxa"/>
+              <w:left w:w="70" w:type="dxa"/>
+              <w:bottom w:w="40" w:type="dxa"/>
+              <w:right w:w="70" w:type="dxa"/>
+            </w:tcMar>
+          </w:tcPr>
+          <w:p>
+            <w:pPr>
+              <w:spacing w:line="230" w:lineRule="auto"/>
+            </w:pPr>
             <w:r>
               <w:rPr>
                 <w:sz w:val="18"/>
                 <w:szCs w:val="18"/>
               </w:rPr>
-              <w:t xml:space="preserve">, prototipo </w:t>
-            </w:r>
-            <w:proofErr w:type="spellStart"/>
+              <w:t>Construcción</w:t>
+            </w:r>
+          </w:p>
+        </w:tc>
+        <w:tc>
+          <w:tcPr>
+            <w:tcW w:w="7040" w:type="dxa"/>
+            <w:shd w:val="clear" w:color="auto" w:fill="F2F2F2"/>
+            <w:tcMar>
+              <w:top w:w="40" w:type="dxa"/>
+              <w:left w:w="70" w:type="dxa"/>
+              <w:bottom w:w="40" w:type="dxa"/>
+              <w:right w:w="70" w:type="dxa"/>
+            </w:tcMar>
+          </w:tcPr>
+          <w:p>
+            <w:pPr>
+              <w:spacing w:line="230" w:lineRule="auto"/>
+            </w:pPr>
             <w:r>
               <w:rPr>
                 <w:sz w:val="18"/>
                 <w:szCs w:val="18"/>
               </w:rPr>
-              <w:t>Figma</w:t>
-            </w:r>
-            <w:proofErr w:type="spellEnd"/>
+              <w:t>SEG + SUS: fundamentos, seguridad, multitenant y planes.</w:t>
+            </w:r>
+          </w:p>
+        </w:tc>
+      </w:tr>
+      <w:tr>
+        <w:tc>
+          <w:tcPr>
+            <w:tcW w:w="820" w:type="dxa"/>
+            <w:shd w:val="clear" w:color="auto" w:fill="FFFFFF"/>
+            <w:tcMar>
+              <w:top w:w="40" w:type="dxa"/>
+              <w:left w:w="70" w:type="dxa"/>
+              <w:bottom w:w="40" w:type="dxa"/>
+              <w:right w:w="70" w:type="dxa"/>
+            </w:tcMar>
+          </w:tcPr>
+          <w:p>
+            <w:pPr>
+              <w:spacing w:line="230" w:lineRule="auto"/>
+            </w:pPr>
             <w:r>
               <w:rPr>
                 <w:sz w:val="18"/>
                 <w:szCs w:val="18"/>
               </w:rPr>
-              <w:t>, UML, documento de diseño, Brand Book y propuesta técnica (historias de usuario ya hechas).</w:t>
+              <w:t>2</w:t>
+            </w:r>
+          </w:p>
+        </w:tc>
+        <w:tc>
+          <w:tcPr>
+            <w:tcW w:w="1500" w:type="dxa"/>
+            <w:shd w:val="clear" w:color="auto" w:fill="FFFFFF"/>
+            <w:tcMar>
+              <w:top w:w="40" w:type="dxa"/>
+              <w:left w:w="70" w:type="dxa"/>
+              <w:bottom w:w="40" w:type="dxa"/>
+              <w:right w:w="70" w:type="dxa"/>
+            </w:tcMar>
+          </w:tcPr>
+          <w:p>
+            <w:pPr>
+              <w:spacing w:line="230" w:lineRule="auto"/>
+            </w:pPr>
+            <w:r>
+              <w:rPr>
+                <w:sz w:val="18"/>
+                <w:szCs w:val="18"/>
+              </w:rPr>
+              <w:t>Construcción</w:t>
+            </w:r>
+          </w:p>
+        </w:tc>
+        <w:tc>
+          <w:tcPr>
+            <w:tcW w:w="7040" w:type="dxa"/>
+            <w:shd w:val="clear" w:color="auto" w:fill="FFFFFF"/>
+            <w:tcMar>
+              <w:top w:w="40" w:type="dxa"/>
+              <w:left w:w="70" w:type="dxa"/>
+              <w:bottom w:w="40" w:type="dxa"/>
+              <w:right w:w="70" w:type="dxa"/>
+            </w:tcMar>
+          </w:tcPr>
+          <w:p>
+            <w:pPr>
+              <w:spacing w:line="230" w:lineRule="auto"/>
+            </w:pPr>
+            <w:r>
+              <w:rPr>
+                <w:sz w:val="18"/>
+                <w:szCs w:val="18"/>
+              </w:rPr>
+              <w:t>INV: inventario, lotes y valoración PEPS.</w:t>
             </w:r>
           </w:p>
         </w:tc>
       </w:tr>
       <w:tr>
-        <w:tblPrEx>
-          <w:tblCellMar>
-            <w:top w:w="0" w:type="dxa"/>
-            <w:bottom w:w="0" w:type="dxa"/>
-          </w:tblCellMar>
-        </w:tblPrEx>
         <w:tc>
           <w:tcPr>
             <w:tcW w:w="820" w:type="dxa"/>
@@ -10093,7 +9346,7 @@
                 <w:sz w:val="18"/>
                 <w:szCs w:val="18"/>
               </w:rPr>
-              <w:t>1</w:t>
+              <w:t>3</w:t>
             </w:r>
           </w:p>
         </w:tc>
@@ -10141,38 +9394,90 @@
                 <w:sz w:val="18"/>
                 <w:szCs w:val="18"/>
               </w:rPr>
-              <w:t xml:space="preserve">SEG + SUS: fundamentos, seguridad, </w:t>
-            </w:r>
-            <w:proofErr w:type="spellStart"/>
+              <w:t>VEN: punto de venta y cierre de caja.</w:t>
+            </w:r>
+          </w:p>
+        </w:tc>
+      </w:tr>
+      <w:tr>
+        <w:tc>
+          <w:tcPr>
+            <w:tcW w:w="820" w:type="dxa"/>
+            <w:shd w:val="clear" w:color="auto" w:fill="FFFFFF"/>
+            <w:tcMar>
+              <w:top w:w="40" w:type="dxa"/>
+              <w:left w:w="70" w:type="dxa"/>
+              <w:bottom w:w="40" w:type="dxa"/>
+              <w:right w:w="70" w:type="dxa"/>
+            </w:tcMar>
+          </w:tcPr>
+          <w:p>
+            <w:pPr>
+              <w:spacing w:line="230" w:lineRule="auto"/>
+            </w:pPr>
             <w:r>
               <w:rPr>
                 <w:sz w:val="18"/>
                 <w:szCs w:val="18"/>
               </w:rPr>
-              <w:t>multitenant</w:t>
-            </w:r>
-            <w:proofErr w:type="spellEnd"/>
+              <w:t>4</w:t>
+            </w:r>
+          </w:p>
+        </w:tc>
+        <w:tc>
+          <w:tcPr>
+            <w:tcW w:w="1500" w:type="dxa"/>
+            <w:shd w:val="clear" w:color="auto" w:fill="FFFFFF"/>
+            <w:tcMar>
+              <w:top w:w="40" w:type="dxa"/>
+              <w:left w:w="70" w:type="dxa"/>
+              <w:bottom w:w="40" w:type="dxa"/>
+              <w:right w:w="70" w:type="dxa"/>
+            </w:tcMar>
+          </w:tcPr>
+          <w:p>
+            <w:pPr>
+              <w:spacing w:line="230" w:lineRule="auto"/>
+            </w:pPr>
             <w:r>
               <w:rPr>
                 <w:sz w:val="18"/>
                 <w:szCs w:val="18"/>
               </w:rPr>
-              <w:t xml:space="preserve"> y planes.</w:t>
+              <w:t>Construcción</w:t>
+            </w:r>
+          </w:p>
+        </w:tc>
+        <w:tc>
+          <w:tcPr>
+            <w:tcW w:w="7040" w:type="dxa"/>
+            <w:shd w:val="clear" w:color="auto" w:fill="FFFFFF"/>
+            <w:tcMar>
+              <w:top w:w="40" w:type="dxa"/>
+              <w:left w:w="70" w:type="dxa"/>
+              <w:bottom w:w="40" w:type="dxa"/>
+              <w:right w:w="70" w:type="dxa"/>
+            </w:tcMar>
+          </w:tcPr>
+          <w:p>
+            <w:pPr>
+              <w:spacing w:line="230" w:lineRule="auto"/>
+            </w:pPr>
+            <w:r>
+              <w:rPr>
+                <w:sz w:val="18"/>
+                <w:szCs w:val="18"/>
+              </w:rPr>
+              <w:t>REP: reportes y kardex.</w:t>
             </w:r>
           </w:p>
         </w:tc>
       </w:tr>
       <w:tr>
-        <w:tblPrEx>
-          <w:tblCellMar>
-            <w:top w:w="0" w:type="dxa"/>
-            <w:bottom w:w="0" w:type="dxa"/>
-          </w:tblCellMar>
-        </w:tblPrEx>
         <w:tc>
           <w:tcPr>
             <w:tcW w:w="820" w:type="dxa"/>
-            <w:shd w:val="clear" w:color="auto" w:fill="FFFFFF"/>
+            <w:shd w:val="clear" w:color="auto" w:fill="F2F2F2"/>
             <w:tcMar>
               <w:top w:w="40" w:type="dxa"/>
               <w:left w:w="70" w:type="dxa"/>
@@ -10189,14 +9494,14 @@
                 <w:sz w:val="18"/>
                 <w:szCs w:val="18"/>
               </w:rPr>
-              <w:t>2</w:t>
+              <w:t>5</w:t>
             </w:r>
           </w:p>
         </w:tc>
         <w:tc>
           <w:tcPr>
             <w:tcW w:w="1500" w:type="dxa"/>
-            <w:shd w:val="clear" w:color="auto" w:fill="FFFFFF"/>
+            <w:shd w:val="clear" w:color="auto" w:fill="F2F2F2"/>
             <w:tcMar>
               <w:top w:w="40" w:type="dxa"/>
               <w:left w:w="70" w:type="dxa"/>
@@ -10220,7 +9525,7 @@
         <w:tc>
           <w:tcPr>
             <w:tcW w:w="7040" w:type="dxa"/>
-            <w:shd w:val="clear" w:color="auto" w:fill="FFFFFF"/>
+            <w:shd w:val="clear" w:color="auto" w:fill="F2F2F2"/>
             <w:tcMar>
               <w:top w:w="40" w:type="dxa"/>
               <w:left w:w="70" w:type="dxa"/>
@@ -10237,290 +9542,12 @@
                 <w:sz w:val="18"/>
                 <w:szCs w:val="18"/>
               </w:rPr>
-              <w:t>INV: inventario, lotes y valoración PEPS.</w:t>
+              <w:t>SED: multisede y traslados.</w:t>
             </w:r>
           </w:p>
         </w:tc>
       </w:tr>
       <w:tr>
-        <w:tblPrEx>
-          <w:tblCellMar>
-            <w:top w:w="0" w:type="dxa"/>
-            <w:bottom w:w="0" w:type="dxa"/>
-          </w:tblCellMar>
-        </w:tblPrEx>
-        <w:tc>
-          <w:tcPr>
-            <w:tcW w:w="820" w:type="dxa"/>
-            <w:shd w:val="clear" w:color="auto" w:fill="F2F2F2"/>
-            <w:tcMar>
-              <w:top w:w="40" w:type="dxa"/>
-              <w:left w:w="70" w:type="dxa"/>
-              <w:bottom w:w="40" w:type="dxa"/>
-              <w:right w:w="70" w:type="dxa"/>
-            </w:tcMar>
-          </w:tcPr>
-          <w:p>
-            <w:pPr>
-              <w:spacing w:line="230" w:lineRule="auto"/>
-            </w:pPr>
-            <w:r>
-              <w:rPr>
-                <w:sz w:val="18"/>
-                <w:szCs w:val="18"/>
-              </w:rPr>
-              <w:t>3</w:t>
-            </w:r>
-          </w:p>
-        </w:tc>
-        <w:tc>
-          <w:tcPr>
-            <w:tcW w:w="1500" w:type="dxa"/>
-            <w:shd w:val="clear" w:color="auto" w:fill="F2F2F2"/>
-            <w:tcMar>
-              <w:top w:w="40" w:type="dxa"/>
-              <w:left w:w="70" w:type="dxa"/>
-              <w:bottom w:w="40" w:type="dxa"/>
-              <w:right w:w="70" w:type="dxa"/>
-            </w:tcMar>
-          </w:tcPr>
-          <w:p>
-            <w:pPr>
-              <w:spacing w:line="230" w:lineRule="auto"/>
-            </w:pPr>
-            <w:r>
-              <w:rPr>
-                <w:sz w:val="18"/>
-                <w:szCs w:val="18"/>
-              </w:rPr>
-              <w:t>Construcción</w:t>
-            </w:r>
-          </w:p>
-        </w:tc>
-        <w:tc>
-          <w:tcPr>
-            <w:tcW w:w="7040" w:type="dxa"/>
-            <w:shd w:val="clear" w:color="auto" w:fill="F2F2F2"/>
-            <w:tcMar>
-              <w:top w:w="40" w:type="dxa"/>
-              <w:left w:w="70" w:type="dxa"/>
-              <w:bottom w:w="40" w:type="dxa"/>
-              <w:right w:w="70" w:type="dxa"/>
-            </w:tcMar>
-          </w:tcPr>
-          <w:p>
-            <w:pPr>
-              <w:spacing w:line="230" w:lineRule="auto"/>
-            </w:pPr>
-            <w:r>
-              <w:rPr>
-                <w:sz w:val="18"/>
-                <w:szCs w:val="18"/>
-              </w:rPr>
-              <w:t>VEN: punto de venta y cierre de caja.</w:t>
-            </w:r>
-          </w:p>
-        </w:tc>
-      </w:tr>
-      <w:tr>
-        <w:tblPrEx>
-          <w:tblCellMar>
-            <w:top w:w="0" w:type="dxa"/>
-            <w:bottom w:w="0" w:type="dxa"/>
-          </w:tblCellMar>
-        </w:tblPrEx>
-        <w:tc>
-          <w:tcPr>
-            <w:tcW w:w="820" w:type="dxa"/>
-            <w:shd w:val="clear" w:color="auto" w:fill="FFFFFF"/>
-            <w:tcMar>
-              <w:top w:w="40" w:type="dxa"/>
-              <w:left w:w="70" w:type="dxa"/>
-              <w:bottom w:w="40" w:type="dxa"/>
-              <w:right w:w="70" w:type="dxa"/>
-            </w:tcMar>
-          </w:tcPr>
-          <w:p>
-            <w:pPr>
-              <w:spacing w:line="230" w:lineRule="auto"/>
-            </w:pPr>
-            <w:r>
-              <w:rPr>
-                <w:sz w:val="18"/>
-                <w:szCs w:val="18"/>
-              </w:rPr>
-              <w:t>4</w:t>
-            </w:r>
-          </w:p>
-        </w:tc>
-        <w:tc>
-          <w:tcPr>
-            <w:tcW w:w="1500" w:type="dxa"/>
-            <w:shd w:val="clear" w:color="auto" w:fill="FFFFFF"/>
-            <w:tcMar>
-              <w:top w:w="40" w:type="dxa"/>
-              <w:left w:w="70" w:type="dxa"/>
-              <w:bottom w:w="40" w:type="dxa"/>
-              <w:right w:w="70" w:type="dxa"/>
-            </w:tcMar>
-          </w:tcPr>
-          <w:p>
-            <w:pPr>
-              <w:spacing w:line="230" w:lineRule="auto"/>
-            </w:pPr>
-            <w:r>
-              <w:rPr>
-                <w:sz w:val="18"/>
-                <w:szCs w:val="18"/>
-              </w:rPr>
-              <w:t>Construcción</w:t>
-            </w:r>
-          </w:p>
-        </w:tc>
-        <w:tc>
-          <w:tcPr>
-            <w:tcW w:w="7040" w:type="dxa"/>
-            <w:shd w:val="clear" w:color="auto" w:fill="FFFFFF"/>
-            <w:tcMar>
-              <w:top w:w="40" w:type="dxa"/>
-              <w:left w:w="70" w:type="dxa"/>
-              <w:bottom w:w="40" w:type="dxa"/>
-              <w:right w:w="70" w:type="dxa"/>
-            </w:tcMar>
-          </w:tcPr>
-          <w:p>
-            <w:pPr>
-              <w:spacing w:line="230" w:lineRule="auto"/>
-            </w:pPr>
-            <w:r>
-              <w:rPr>
-                <w:sz w:val="18"/>
-                <w:szCs w:val="18"/>
-              </w:rPr>
-              <w:t xml:space="preserve">REP: reportes y </w:t>
-            </w:r>
-            <w:proofErr w:type="spellStart"/>
-            <w:r>
-              <w:rPr>
-                <w:sz w:val="18"/>
-                <w:szCs w:val="18"/>
-              </w:rPr>
-              <w:t>kardex</w:t>
-            </w:r>
-            <w:proofErr w:type="spellEnd"/>
-            <w:r>
-              <w:rPr>
-                <w:sz w:val="18"/>
-                <w:szCs w:val="18"/>
-              </w:rPr>
-              <w:t>.</w:t>
-            </w:r>
-          </w:p>
-        </w:tc>
-      </w:tr>
-      <w:tr>
-        <w:tblPrEx>
-          <w:tblCellMar>
-            <w:top w:w="0" w:type="dxa"/>
-            <w:bottom w:w="0" w:type="dxa"/>
-          </w:tblCellMar>
-        </w:tblPrEx>
-        <w:tc>
-          <w:tcPr>
-            <w:tcW w:w="820" w:type="dxa"/>
-            <w:shd w:val="clear" w:color="auto" w:fill="F2F2F2"/>
-            <w:tcMar>
-              <w:top w:w="40" w:type="dxa"/>
-              <w:left w:w="70" w:type="dxa"/>
-              <w:bottom w:w="40" w:type="dxa"/>
-              <w:right w:w="70" w:type="dxa"/>
-            </w:tcMar>
-          </w:tcPr>
-          <w:p>
-            <w:pPr>
-              <w:spacing w:line="230" w:lineRule="auto"/>
-            </w:pPr>
-            <w:r>
-              <w:rPr>
-                <w:sz w:val="18"/>
-                <w:szCs w:val="18"/>
-              </w:rPr>
-              <w:t>5</w:t>
-            </w:r>
-          </w:p>
-        </w:tc>
-        <w:tc>
-          <w:tcPr>
-            <w:tcW w:w="1500" w:type="dxa"/>
-            <w:shd w:val="clear" w:color="auto" w:fill="F2F2F2"/>
-            <w:tcMar>
-              <w:top w:w="40" w:type="dxa"/>
-              <w:left w:w="70" w:type="dxa"/>
-              <w:bottom w:w="40" w:type="dxa"/>
-              <w:right w:w="70" w:type="dxa"/>
-            </w:tcMar>
-          </w:tcPr>
-          <w:p>
-            <w:pPr>
-              <w:spacing w:line="230" w:lineRule="auto"/>
-            </w:pPr>
-            <w:r>
-              <w:rPr>
-                <w:sz w:val="18"/>
-                <w:szCs w:val="18"/>
-              </w:rPr>
-              <w:t>Construcción</w:t>
-            </w:r>
-          </w:p>
-        </w:tc>
-        <w:tc>
-          <w:tcPr>
-            <w:tcW w:w="7040" w:type="dxa"/>
-            <w:shd w:val="clear" w:color="auto" w:fill="F2F2F2"/>
-            <w:tcMar>
-              <w:top w:w="40" w:type="dxa"/>
-              <w:left w:w="70" w:type="dxa"/>
-              <w:bottom w:w="40" w:type="dxa"/>
-              <w:right w:w="70" w:type="dxa"/>
-            </w:tcMar>
-          </w:tcPr>
-          <w:p>
-            <w:pPr>
-              <w:spacing w:line="230" w:lineRule="auto"/>
-            </w:pPr>
-            <w:r>
-              <w:rPr>
-                <w:sz w:val="18"/>
-                <w:szCs w:val="18"/>
-              </w:rPr>
-              <w:t xml:space="preserve">SED: </w:t>
-            </w:r>
-            <w:proofErr w:type="spellStart"/>
-            <w:r>
-              <w:rPr>
-                <w:sz w:val="18"/>
-                <w:szCs w:val="18"/>
-              </w:rPr>
-              <w:t>multisede</w:t>
-            </w:r>
-            <w:proofErr w:type="spellEnd"/>
-            <w:r>
-              <w:rPr>
-                <w:sz w:val="18"/>
-                <w:szCs w:val="18"/>
-              </w:rPr>
-              <w:t xml:space="preserve"> y traslados.</w:t>
-            </w:r>
-          </w:p>
-        </w:tc>
-      </w:tr>
-      <w:tr>
-        <w:tblPrEx>
-          <w:tblCellMar>
-            <w:top w:w="0" w:type="dxa"/>
-            <w:bottom w:w="0" w:type="dxa"/>
-          </w:tblCellMar>
-        </w:tblPrEx>
         <w:tc>
           <w:tcPr>
             <w:tcW w:w="820" w:type="dxa"/>
@@ -10610,51 +9637,7 @@
           <w:szCs w:val="28"/>
         </w:rPr>
         <w:lastRenderedPageBreak/>
-        <w:t>9. Definición de Terminado (</w:t>
-      </w:r>
-      <w:proofErr w:type="spellStart"/>
-      <w:r>
-        <w:rPr>
-          <w:b/>
-          <w:bCs/>
-          <w:color w:val="1F3864"/>
-          <w:sz w:val="28"/>
-          <w:szCs w:val="28"/>
-        </w:rPr>
-        <w:t>Definition</w:t>
-      </w:r>
-      <w:proofErr w:type="spellEnd"/>
-      <w:r>
-        <w:rPr>
-          <w:b/>
-          <w:bCs/>
-          <w:color w:val="1F3864"/>
-          <w:sz w:val="28"/>
-          <w:szCs w:val="28"/>
-        </w:rPr>
-        <w:t xml:space="preserve"> </w:t>
-      </w:r>
-      <w:proofErr w:type="spellStart"/>
-      <w:r>
-        <w:rPr>
-          <w:b/>
-          <w:bCs/>
-          <w:color w:val="1F3864"/>
-          <w:sz w:val="28"/>
-          <w:szCs w:val="28"/>
-        </w:rPr>
-        <w:t>of</w:t>
-      </w:r>
-      <w:proofErr w:type="spellEnd"/>
-      <w:r>
-        <w:rPr>
-          <w:b/>
-          <w:bCs/>
-          <w:color w:val="1F3864"/>
-          <w:sz w:val="28"/>
-          <w:szCs w:val="28"/>
-        </w:rPr>
-        <w:t xml:space="preserve"> Done)</w:t>
+        <w:t>9. Definición de Terminado (Definition of Done)</w:t>
       </w:r>
     </w:p>
     <w:p>
@@ -10818,15 +9801,7 @@
         <w:jc w:val="both"/>
       </w:pPr>
       <w:r>
-        <w:t>Etiquetas (</w:t>
-      </w:r>
-      <w:proofErr w:type="spellStart"/>
-      <w:r>
-        <w:t>labels</w:t>
-      </w:r>
-      <w:proofErr w:type="spellEnd"/>
-      <w:r>
-        <w:t>) recomendadas:</w:t>
+        <w:t>Etiquetas (labels) recomendadas:</w:t>
       </w:r>
     </w:p>
     <w:p>

</xml_diff>